<commit_message>
Resolved the 'Multiple Interface Match' conflict and mastered the art of subnetting
</commit_message>
<xml_diff>
--- a/docs/ES/net_practice_ES.docx
+++ b/docs/ES/net_practice_ES.docx
@@ -370,7 +370,7 @@
           <w:r>
             <w:fldChar w:fldCharType="separate"/>
           </w:r>
-          <w:hyperlink w:anchor="_Toc227503419" w:history="1">
+          <w:hyperlink w:anchor="_Toc227661418" w:history="1">
             <w:r>
               <w:rPr>
                 <w:rStyle w:val="Hipervnculo"/>
@@ -417,7 +417,7 @@
                 <w:noProof/>
                 <w:webHidden/>
               </w:rPr>
-              <w:instrText xml:space="preserve"> PAGEREF _Toc227503419 \h </w:instrText>
+              <w:instrText xml:space="preserve"> PAGEREF _Toc227661418 \h </w:instrText>
             </w:r>
             <w:r>
               <w:rPr>
@@ -461,7 +461,7 @@
               <w:sz w:val="24"/>
             </w:rPr>
           </w:pPr>
-          <w:hyperlink w:anchor="_Toc227503420" w:history="1">
+          <w:hyperlink w:anchor="_Toc227661419" w:history="1">
             <w:r>
               <w:rPr>
                 <w:rStyle w:val="Hipervnculo"/>
@@ -506,7 +506,7 @@
                 <w:noProof/>
                 <w:webHidden/>
               </w:rPr>
-              <w:instrText xml:space="preserve"> PAGEREF _Toc227503420 \h </w:instrText>
+              <w:instrText xml:space="preserve"> PAGEREF _Toc227661419 \h </w:instrText>
             </w:r>
             <w:r>
               <w:rPr>
@@ -550,7 +550,7 @@
               <w:sz w:val="24"/>
             </w:rPr>
           </w:pPr>
-          <w:hyperlink w:anchor="_Toc227503421" w:history="1">
+          <w:hyperlink w:anchor="_Toc227661420" w:history="1">
             <w:r>
               <w:rPr>
                 <w:rStyle w:val="Hipervnculo"/>
@@ -595,7 +595,7 @@
                 <w:noProof/>
                 <w:webHidden/>
               </w:rPr>
-              <w:instrText xml:space="preserve"> PAGEREF _Toc227503421 \h </w:instrText>
+              <w:instrText xml:space="preserve"> PAGEREF _Toc227661420 \h </w:instrText>
             </w:r>
             <w:r>
               <w:rPr>
@@ -639,7 +639,7 @@
               <w:sz w:val="24"/>
             </w:rPr>
           </w:pPr>
-          <w:hyperlink w:anchor="_Toc227503422" w:history="1">
+          <w:hyperlink w:anchor="_Toc227661421" w:history="1">
             <w:r>
               <w:rPr>
                 <w:rStyle w:val="Hipervnculo"/>
@@ -686,7 +686,7 @@
                 <w:noProof/>
                 <w:webHidden/>
               </w:rPr>
-              <w:instrText xml:space="preserve"> PAGEREF _Toc227503422 \h </w:instrText>
+              <w:instrText xml:space="preserve"> PAGEREF _Toc227661421 \h </w:instrText>
             </w:r>
             <w:r>
               <w:rPr>
@@ -730,7 +730,7 @@
               <w:sz w:val="24"/>
             </w:rPr>
           </w:pPr>
-          <w:hyperlink w:anchor="_Toc227503423" w:history="1">
+          <w:hyperlink w:anchor="_Toc227661422" w:history="1">
             <w:r>
               <w:rPr>
                 <w:rStyle w:val="Hipervnculo"/>
@@ -777,7 +777,7 @@
                 <w:noProof/>
                 <w:webHidden/>
               </w:rPr>
-              <w:instrText xml:space="preserve"> PAGEREF _Toc227503423 \h </w:instrText>
+              <w:instrText xml:space="preserve"> PAGEREF _Toc227661422 \h </w:instrText>
             </w:r>
             <w:r>
               <w:rPr>
@@ -821,7 +821,7 @@
               <w:sz w:val="24"/>
             </w:rPr>
           </w:pPr>
-          <w:hyperlink w:anchor="_Toc227503424" w:history="1">
+          <w:hyperlink w:anchor="_Toc227661423" w:history="1">
             <w:r>
               <w:rPr>
                 <w:rStyle w:val="Hipervnculo"/>
@@ -868,7 +868,7 @@
                 <w:noProof/>
                 <w:webHidden/>
               </w:rPr>
-              <w:instrText xml:space="preserve"> PAGEREF _Toc227503424 \h </w:instrText>
+              <w:instrText xml:space="preserve"> PAGEREF _Toc227661423 \h </w:instrText>
             </w:r>
             <w:r>
               <w:rPr>
@@ -912,7 +912,7 @@
               <w:sz w:val="24"/>
             </w:rPr>
           </w:pPr>
-          <w:hyperlink w:anchor="_Toc227503425" w:history="1">
+          <w:hyperlink w:anchor="_Toc227661424" w:history="1">
             <w:r>
               <w:rPr>
                 <w:rStyle w:val="Hipervnculo"/>
@@ -957,7 +957,7 @@
                 <w:noProof/>
                 <w:webHidden/>
               </w:rPr>
-              <w:instrText xml:space="preserve"> PAGEREF _Toc227503425 \h </w:instrText>
+              <w:instrText xml:space="preserve"> PAGEREF _Toc227661424 \h </w:instrText>
             </w:r>
             <w:r>
               <w:rPr>
@@ -1000,7 +1000,7 @@
               <w:sz w:val="24"/>
             </w:rPr>
           </w:pPr>
-          <w:hyperlink w:anchor="_Toc227503426" w:history="1">
+          <w:hyperlink w:anchor="_Toc227661425" w:history="1">
             <w:r>
               <w:rPr>
                 <w:rStyle w:val="Hipervnculo"/>
@@ -1030,7 +1030,7 @@
                 <w:noProof/>
                 <w:webHidden/>
               </w:rPr>
-              <w:instrText xml:space="preserve"> PAGEREF _Toc227503426 \h </w:instrText>
+              <w:instrText xml:space="preserve"> PAGEREF _Toc227661425 \h </w:instrText>
             </w:r>
             <w:r>
               <w:rPr>
@@ -1073,7 +1073,7 @@
               <w:sz w:val="24"/>
             </w:rPr>
           </w:pPr>
-          <w:hyperlink w:anchor="_Toc227503427" w:history="1">
+          <w:hyperlink w:anchor="_Toc227661426" w:history="1">
             <w:r>
               <w:rPr>
                 <w:rStyle w:val="Hipervnculo"/>
@@ -1103,7 +1103,7 @@
                 <w:noProof/>
                 <w:webHidden/>
               </w:rPr>
-              <w:instrText xml:space="preserve"> PAGEREF _Toc227503427 \h </w:instrText>
+              <w:instrText xml:space="preserve"> PAGEREF _Toc227661426 \h </w:instrText>
             </w:r>
             <w:r>
               <w:rPr>
@@ -1147,7 +1147,7 @@
               <w:sz w:val="24"/>
             </w:rPr>
           </w:pPr>
-          <w:hyperlink w:anchor="_Toc227503428" w:history="1">
+          <w:hyperlink w:anchor="_Toc227661427" w:history="1">
             <w:r>
               <w:rPr>
                 <w:rStyle w:val="Hipervnculo"/>
@@ -1194,7 +1194,7 @@
                 <w:noProof/>
                 <w:webHidden/>
               </w:rPr>
-              <w:instrText xml:space="preserve"> PAGEREF _Toc227503428 \h </w:instrText>
+              <w:instrText xml:space="preserve"> PAGEREF _Toc227661427 \h </w:instrText>
             </w:r>
             <w:r>
               <w:rPr>
@@ -1238,7 +1238,7 @@
               <w:sz w:val="24"/>
             </w:rPr>
           </w:pPr>
-          <w:hyperlink w:anchor="_Toc227503429" w:history="1">
+          <w:hyperlink w:anchor="_Toc227661428" w:history="1">
             <w:r>
               <w:rPr>
                 <w:rStyle w:val="Hipervnculo"/>
@@ -1285,7 +1285,7 @@
                 <w:noProof/>
                 <w:webHidden/>
               </w:rPr>
-              <w:instrText xml:space="preserve"> PAGEREF _Toc227503429 \h </w:instrText>
+              <w:instrText xml:space="preserve"> PAGEREF _Toc227661428 \h </w:instrText>
             </w:r>
             <w:r>
               <w:rPr>
@@ -1329,7 +1329,7 @@
               <w:sz w:val="24"/>
             </w:rPr>
           </w:pPr>
-          <w:hyperlink w:anchor="_Toc227503430" w:history="1">
+          <w:hyperlink w:anchor="_Toc227661429" w:history="1">
             <w:r>
               <w:rPr>
                 <w:rStyle w:val="Hipervnculo"/>
@@ -1374,7 +1374,7 @@
                 <w:noProof/>
                 <w:webHidden/>
               </w:rPr>
-              <w:instrText xml:space="preserve"> PAGEREF _Toc227503430 \h </w:instrText>
+              <w:instrText xml:space="preserve"> PAGEREF _Toc227661429 \h </w:instrText>
             </w:r>
             <w:r>
               <w:rPr>
@@ -1417,7 +1417,7 @@
               <w:sz w:val="24"/>
             </w:rPr>
           </w:pPr>
-          <w:hyperlink w:anchor="_Toc227503431" w:history="1">
+          <w:hyperlink w:anchor="_Toc227661430" w:history="1">
             <w:r>
               <w:rPr>
                 <w:rStyle w:val="Hipervnculo"/>
@@ -1445,7 +1445,7 @@
                 <w:noProof/>
                 <w:webHidden/>
               </w:rPr>
-              <w:instrText xml:space="preserve"> PAGEREF _Toc227503431 \h </w:instrText>
+              <w:instrText xml:space="preserve"> PAGEREF _Toc227661430 \h </w:instrText>
             </w:r>
             <w:r>
               <w:rPr>
@@ -1488,7 +1488,7 @@
               <w:sz w:val="24"/>
             </w:rPr>
           </w:pPr>
-          <w:hyperlink w:anchor="_Toc227503432" w:history="1">
+          <w:hyperlink w:anchor="_Toc227661431" w:history="1">
             <w:r>
               <w:rPr>
                 <w:rStyle w:val="Hipervnculo"/>
@@ -1516,7 +1516,7 @@
                 <w:noProof/>
                 <w:webHidden/>
               </w:rPr>
-              <w:instrText xml:space="preserve"> PAGEREF _Toc227503432 \h </w:instrText>
+              <w:instrText xml:space="preserve"> PAGEREF _Toc227661431 \h </w:instrText>
             </w:r>
             <w:r>
               <w:rPr>
@@ -1559,7 +1559,7 @@
               <w:sz w:val="24"/>
             </w:rPr>
           </w:pPr>
-          <w:hyperlink w:anchor="_Toc227503433" w:history="1">
+          <w:hyperlink w:anchor="_Toc227661432" w:history="1">
             <w:r>
               <w:rPr>
                 <w:rStyle w:val="Hipervnculo"/>
@@ -1587,7 +1587,7 @@
                 <w:noProof/>
                 <w:webHidden/>
               </w:rPr>
-              <w:instrText xml:space="preserve"> PAGEREF _Toc227503433 \h </w:instrText>
+              <w:instrText xml:space="preserve"> PAGEREF _Toc227661432 \h </w:instrText>
             </w:r>
             <w:r>
               <w:rPr>
@@ -1608,6 +1608,148 @@
                 <w:webHidden/>
               </w:rPr>
               <w:t>13</w:t>
+            </w:r>
+            <w:r>
+              <w:rPr>
+                <w:noProof/>
+                <w:webHidden/>
+              </w:rPr>
+              <w:fldChar w:fldCharType="end"/>
+            </w:r>
+          </w:hyperlink>
+        </w:p>
+        <w:p>
+          <w:pPr>
+            <w:pStyle w:val="TDC2"/>
+            <w:tabs>
+              <w:tab w:val="right" w:leader="dot" w:pos="8828"/>
+            </w:tabs>
+            <w:rPr>
+              <w:rFonts w:eastAsiaTheme="minorEastAsia"/>
+              <w:noProof/>
+              <w:sz w:val="24"/>
+            </w:rPr>
+          </w:pPr>
+          <w:hyperlink w:anchor="_Toc227661433" w:history="1">
+            <w:r>
+              <w:rPr>
+                <w:rStyle w:val="Hipervnculo"/>
+                <w:noProof/>
+                <w:lang w:val="es-ES"/>
+              </w:rPr>
+              <w:t>Nivel 6 — Conectar un cliente a Internet</w:t>
+            </w:r>
+            <w:r>
+              <w:rPr>
+                <w:noProof/>
+                <w:webHidden/>
+              </w:rPr>
+              <w:tab/>
+            </w:r>
+            <w:r>
+              <w:rPr>
+                <w:noProof/>
+                <w:webHidden/>
+              </w:rPr>
+              <w:fldChar w:fldCharType="begin"/>
+            </w:r>
+            <w:r>
+              <w:rPr>
+                <w:noProof/>
+                <w:webHidden/>
+              </w:rPr>
+              <w:instrText xml:space="preserve"> PAGEREF _Toc227661433 \h </w:instrText>
+            </w:r>
+            <w:r>
+              <w:rPr>
+                <w:noProof/>
+                <w:webHidden/>
+              </w:rPr>
+            </w:r>
+            <w:r>
+              <w:rPr>
+                <w:noProof/>
+                <w:webHidden/>
+              </w:rPr>
+              <w:fldChar w:fldCharType="separate"/>
+            </w:r>
+            <w:r>
+              <w:rPr>
+                <w:noProof/>
+                <w:webHidden/>
+              </w:rPr>
+              <w:t>14</w:t>
+            </w:r>
+            <w:r>
+              <w:rPr>
+                <w:noProof/>
+                <w:webHidden/>
+              </w:rPr>
+              <w:fldChar w:fldCharType="end"/>
+            </w:r>
+          </w:hyperlink>
+        </w:p>
+        <w:p>
+          <w:pPr>
+            <w:pStyle w:val="TDC2"/>
+            <w:tabs>
+              <w:tab w:val="right" w:leader="dot" w:pos="8828"/>
+            </w:tabs>
+            <w:rPr>
+              <w:rFonts w:eastAsiaTheme="minorEastAsia"/>
+              <w:noProof/>
+              <w:sz w:val="24"/>
+            </w:rPr>
+          </w:pPr>
+          <w:hyperlink w:anchor="_Toc227661434" w:history="1">
+            <w:r>
+              <w:rPr>
+                <w:rStyle w:val="Hipervnculo"/>
+                <w:noProof/>
+                <w:lang w:val="es-ES"/>
+              </w:rPr>
+              <w:t>Nivel 7 — Redes separadas y el concepto de overlapping</w:t>
+            </w:r>
+            <w:r>
+              <w:rPr>
+                <w:noProof/>
+                <w:webHidden/>
+              </w:rPr>
+              <w:tab/>
+            </w:r>
+            <w:r>
+              <w:rPr>
+                <w:noProof/>
+                <w:webHidden/>
+              </w:rPr>
+              <w:fldChar w:fldCharType="begin"/>
+            </w:r>
+            <w:r>
+              <w:rPr>
+                <w:noProof/>
+                <w:webHidden/>
+              </w:rPr>
+              <w:instrText xml:space="preserve"> PAGEREF _Toc227661434 \h </w:instrText>
+            </w:r>
+            <w:r>
+              <w:rPr>
+                <w:noProof/>
+                <w:webHidden/>
+              </w:rPr>
+            </w:r>
+            <w:r>
+              <w:rPr>
+                <w:noProof/>
+                <w:webHidden/>
+              </w:rPr>
+              <w:fldChar w:fldCharType="separate"/>
+            </w:r>
+            <w:r>
+              <w:rPr>
+                <w:noProof/>
+                <w:webHidden/>
+              </w:rPr>
+              <w:t>15</w:t>
             </w:r>
             <w:r>
               <w:rPr>
@@ -1656,7 +1798,7 @@
           <w:lang w:val="es-ES"/>
         </w:rPr>
       </w:pPr>
-      <w:bookmarkStart w:id="0" w:name="_Toc227503419"/>
+      <w:bookmarkStart w:id="0" w:name="_Toc227661418"/>
       <w:r>
         <w:rPr>
           <w:rFonts w:ascii="Arial" w:eastAsia="Arial" w:hAnsi="Arial" w:cs="Arial"/>
@@ -2699,7 +2841,7 @@
         </w:numPr>
         <w:spacing w:after="160"/>
       </w:pPr>
-      <w:bookmarkStart w:id="1" w:name="_Toc227503420"/>
+      <w:bookmarkStart w:id="1" w:name="_Toc227661419"/>
       <w:r>
         <w:rPr>
           <w:rFonts w:ascii="Arial" w:eastAsia="Arial" w:hAnsi="Arial" w:cs="Arial"/>
@@ -3770,7 +3912,7 @@
         </w:numPr>
         <w:spacing w:after="160"/>
       </w:pPr>
-      <w:bookmarkStart w:id="2" w:name="_Toc227503421"/>
+      <w:bookmarkStart w:id="2" w:name="_Toc227661420"/>
       <w:proofErr w:type="spellStart"/>
       <w:r>
         <w:rPr>
@@ -4980,7 +5122,7 @@
           <w:lang w:val="es-ES"/>
         </w:rPr>
       </w:pPr>
-      <w:bookmarkStart w:id="3" w:name="_Toc227503422"/>
+      <w:bookmarkStart w:id="3" w:name="_Toc227661421"/>
       <w:r>
         <w:rPr>
           <w:rFonts w:ascii="Arial" w:eastAsia="Arial" w:hAnsi="Arial" w:cs="Arial"/>
@@ -6811,7 +6953,7 @@
           <w:lang w:val="es-ES"/>
         </w:rPr>
       </w:pPr>
-      <w:bookmarkStart w:id="4" w:name="_Toc227503423"/>
+      <w:bookmarkStart w:id="4" w:name="_Toc227661422"/>
       <w:r>
         <w:rPr>
           <w:rFonts w:ascii="Arial" w:eastAsia="Arial" w:hAnsi="Arial" w:cs="Arial"/>
@@ -7335,7 +7477,7 @@
           <w:lang w:val="es-ES"/>
         </w:rPr>
       </w:pPr>
-      <w:bookmarkStart w:id="5" w:name="_Toc227503424"/>
+      <w:bookmarkStart w:id="5" w:name="_Toc227661423"/>
       <w:r>
         <w:rPr>
           <w:rFonts w:ascii="Arial" w:eastAsia="Arial" w:hAnsi="Arial" w:cs="Arial"/>
@@ -7407,13 +7549,6 @@
     </w:p>
     <w:p>
       <w:pPr>
-        <w:rPr>
-          <w:lang w:val="es-ES"/>
-        </w:rPr>
-      </w:pPr>
-    </w:p>
-    <w:p>
-      <w:pPr>
         <w:spacing w:before="200" w:after="100"/>
         <w:rPr>
           <w:lang w:val="es-ES"/>
@@ -7501,13 +7636,6 @@
         </w:rPr>
         <w:t>.</w:t>
       </w:r>
-    </w:p>
-    <w:p>
-      <w:pPr>
-        <w:rPr>
-          <w:lang w:val="es-ES"/>
-        </w:rPr>
-      </w:pPr>
     </w:p>
     <w:p>
       <w:pPr>
@@ -8214,7 +8342,7 @@
         </w:numPr>
         <w:spacing w:after="160"/>
       </w:pPr>
-      <w:bookmarkStart w:id="6" w:name="_Toc227503425"/>
+      <w:bookmarkStart w:id="6" w:name="_Toc227661424"/>
       <w:r>
         <w:rPr>
           <w:rFonts w:ascii="Arial" w:eastAsia="Arial" w:hAnsi="Arial" w:cs="Arial"/>
@@ -8236,7 +8364,7 @@
           <w:lang w:val="es-ES"/>
         </w:rPr>
       </w:pPr>
-      <w:bookmarkStart w:id="7" w:name="_Toc227503426"/>
+      <w:bookmarkStart w:id="7" w:name="_Toc227661425"/>
       <w:r>
         <w:rPr>
           <w:rFonts w:ascii="Arial" w:eastAsia="Arial" w:hAnsi="Arial" w:cs="Arial"/>
@@ -8309,20 +8437,13 @@
     </w:p>
     <w:p>
       <w:pPr>
-        <w:rPr>
-          <w:lang w:val="es-ES"/>
-        </w:rPr>
-      </w:pPr>
-    </w:p>
-    <w:p>
-      <w:pPr>
         <w:pStyle w:val="Ttulo2"/>
         <w:spacing w:before="280" w:after="120"/>
         <w:rPr>
           <w:lang w:val="es-ES"/>
         </w:rPr>
       </w:pPr>
-      <w:bookmarkStart w:id="8" w:name="_Toc227503427"/>
+      <w:bookmarkStart w:id="8" w:name="_Toc227661426"/>
       <w:proofErr w:type="spellStart"/>
       <w:r>
         <w:rPr>
@@ -8454,13 +8575,6 @@
         </w:rPr>
         <w:t xml:space="preserve"> puede pertenecer a una red diferente.</w:t>
       </w:r>
-    </w:p>
-    <w:p>
-      <w:pPr>
-        <w:rPr>
-          <w:lang w:val="es-ES"/>
-        </w:rPr>
-      </w:pPr>
     </w:p>
     <w:tbl>
       <w:tblPr>
@@ -9029,7 +9143,7 @@
           <w:lang w:val="es-ES"/>
         </w:rPr>
       </w:pPr>
-      <w:bookmarkStart w:id="9" w:name="_Toc227503428"/>
+      <w:bookmarkStart w:id="9" w:name="_Toc227661427"/>
       <w:r>
         <w:rPr>
           <w:rFonts w:ascii="Arial" w:eastAsia="Arial" w:hAnsi="Arial" w:cs="Arial"/>
@@ -9139,6 +9253,7 @@
     </w:p>
     <w:p>
       <w:pPr>
+        <w:pStyle w:val="Sinespaciado"/>
         <w:rPr>
           <w:lang w:val="es-ES"/>
         </w:rPr>
@@ -10291,7 +10406,7 @@
           <w:lang w:val="es-ES"/>
         </w:rPr>
       </w:pPr>
-      <w:bookmarkStart w:id="10" w:name="_Toc227503429"/>
+      <w:bookmarkStart w:id="10" w:name="_Toc227661428"/>
       <w:r>
         <w:rPr>
           <w:rFonts w:ascii="Arial" w:eastAsia="Arial" w:hAnsi="Arial" w:cs="Arial"/>
@@ -11051,7 +11166,7 @@
           <w:lang w:val="es-ES"/>
         </w:rPr>
       </w:pPr>
-      <w:bookmarkStart w:id="11" w:name="_Toc227503430"/>
+      <w:bookmarkStart w:id="11" w:name="_Toc227661429"/>
       <w:r>
         <w:rPr>
           <w:lang w:val="es-ES"/>
@@ -11068,7 +11183,7 @@
           <w:lang w:val="es-ES"/>
         </w:rPr>
       </w:pPr>
-      <w:bookmarkStart w:id="12" w:name="_Toc227503431"/>
+      <w:bookmarkStart w:id="12" w:name="_Toc227661430"/>
       <w:r>
         <w:rPr>
           <w:rStyle w:val="Textoennegrita"/>
@@ -11155,7 +11270,7 @@
           <w:lang w:val="es-ES"/>
         </w:rPr>
       </w:pPr>
-      <w:bookmarkStart w:id="13" w:name="_Toc227503432"/>
+      <w:bookmarkStart w:id="13" w:name="_Toc227661431"/>
       <w:r>
         <w:rPr>
           <w:rStyle w:val="Textoennegrita"/>
@@ -11294,7 +11409,7 @@
           <w:lang w:val="es-ES"/>
         </w:rPr>
       </w:pPr>
-      <w:bookmarkStart w:id="14" w:name="_Toc227503433"/>
+      <w:bookmarkStart w:id="14" w:name="_Toc227661432"/>
       <w:r>
         <w:rPr>
           <w:rStyle w:val="Textoennegrita"/>
@@ -11473,6 +11588,2073 @@
           <w:lang w:val="es-ES"/>
         </w:rPr>
         <w:t xml:space="preserve"> en la misma red y pueden comunicarse directamente.</w:t>
+      </w:r>
+    </w:p>
+    <w:p>
+      <w:pPr>
+        <w:pStyle w:val="Sinespaciado"/>
+        <w:rPr>
+          <w:lang w:val="es-ES"/>
+        </w:rPr>
+      </w:pPr>
+    </w:p>
+    <w:p>
+      <w:pPr>
+        <w:pStyle w:val="Ttulo2"/>
+        <w:pageBreakBefore/>
+        <w:rPr>
+          <w:lang w:val="es-ES"/>
+        </w:rPr>
+      </w:pPr>
+      <w:bookmarkStart w:id="15" w:name="_Toc227661433"/>
+      <w:r>
+        <w:rPr>
+          <w:lang w:val="es-ES"/>
+        </w:rPr>
+        <w:lastRenderedPageBreak/>
+        <w:t xml:space="preserve">Nivel </w:t>
+      </w:r>
+      <w:r>
+        <w:rPr>
+          <w:lang w:val="es-ES"/>
+        </w:rPr>
+        <w:t xml:space="preserve">6 </w:t>
+      </w:r>
+      <w:r>
+        <w:rPr>
+          <w:lang w:val="es-ES"/>
+        </w:rPr>
+        <w:t>— Conectar un cliente a Internet</w:t>
+      </w:r>
+      <w:bookmarkEnd w:id="15"/>
+    </w:p>
+    <w:p>
+      <w:pPr>
+        <w:pStyle w:val="Sinespaciado"/>
+        <w:rPr>
+          <w:lang w:val="es-ES"/>
+        </w:rPr>
+      </w:pPr>
+      <w:r>
+        <w:rPr>
+          <w:lang w:val="es-ES"/>
+        </w:rPr>
+        <w:t xml:space="preserve">Este nivel introduce el concepto de Internet dentro de </w:t>
+      </w:r>
+      <w:proofErr w:type="spellStart"/>
+      <w:r>
+        <w:rPr>
+          <w:lang w:val="es-ES"/>
+        </w:rPr>
+        <w:t>NetPractice</w:t>
+      </w:r>
+      <w:proofErr w:type="spellEnd"/>
+      <w:r>
+        <w:rPr>
+          <w:lang w:val="es-ES"/>
+        </w:rPr>
+        <w:t xml:space="preserve">. El "Internet" </w:t>
+      </w:r>
+      <w:proofErr w:type="spellStart"/>
+      <w:r>
+        <w:rPr>
+          <w:lang w:val="es-ES"/>
+        </w:rPr>
+        <w:t>aqui</w:t>
+      </w:r>
+      <w:proofErr w:type="spellEnd"/>
+      <w:r>
+        <w:rPr>
+          <w:lang w:val="es-ES"/>
+        </w:rPr>
+        <w:t xml:space="preserve"> es simplemente un </w:t>
+      </w:r>
+      <w:proofErr w:type="spellStart"/>
+      <w:r>
+        <w:rPr>
+          <w:lang w:val="es-ES"/>
+        </w:rPr>
+        <w:t>router</w:t>
+      </w:r>
+      <w:proofErr w:type="spellEnd"/>
+      <w:r>
+        <w:rPr>
+          <w:lang w:val="es-ES"/>
+        </w:rPr>
+        <w:t xml:space="preserve"> especial con muchas interfaces. El objetivo es que el cliente A pueda comunicarse con Internet y viceversa.</w:t>
+      </w:r>
+    </w:p>
+    <w:p>
+      <w:pPr>
+        <w:pStyle w:val="Sinespaciado"/>
+        <w:rPr>
+          <w:lang w:val="es-ES"/>
+        </w:rPr>
+      </w:pPr>
+    </w:p>
+    <w:p>
+      <w:pPr>
+        <w:pStyle w:val="Sinespaciado"/>
+        <w:rPr>
+          <w:b/>
+          <w:bCs/>
+          <w:lang w:val="es-ES"/>
+        </w:rPr>
+      </w:pPr>
+      <w:r>
+        <w:rPr>
+          <w:b/>
+          <w:bCs/>
+          <w:lang w:val="es-ES"/>
+        </w:rPr>
+        <w:t xml:space="preserve">Paso 1 — Configurar </w:t>
+      </w:r>
+      <w:proofErr w:type="spellStart"/>
+      <w:r>
+        <w:rPr>
+          <w:b/>
+          <w:bCs/>
+          <w:lang w:val="es-ES"/>
+        </w:rPr>
+        <w:t>IPs</w:t>
+      </w:r>
+      <w:proofErr w:type="spellEnd"/>
+      <w:r>
+        <w:rPr>
+          <w:b/>
+          <w:bCs/>
+          <w:lang w:val="es-ES"/>
+        </w:rPr>
+        <w:t xml:space="preserve"> y mascaras</w:t>
+      </w:r>
+    </w:p>
+    <w:p>
+      <w:pPr>
+        <w:pStyle w:val="Sinespaciado"/>
+        <w:rPr>
+          <w:lang w:val="es-ES"/>
+        </w:rPr>
+      </w:pPr>
+      <w:r>
+        <w:rPr>
+          <w:lang w:val="es-ES"/>
+        </w:rPr>
+        <w:t xml:space="preserve">El cliente A y la interfaz R1 del </w:t>
+      </w:r>
+      <w:proofErr w:type="spellStart"/>
+      <w:r>
+        <w:rPr>
+          <w:lang w:val="es-ES"/>
+        </w:rPr>
+        <w:t>router</w:t>
+      </w:r>
+      <w:proofErr w:type="spellEnd"/>
+      <w:r>
+        <w:rPr>
+          <w:lang w:val="es-ES"/>
+        </w:rPr>
+        <w:t xml:space="preserve"> </w:t>
+      </w:r>
+      <w:r>
+        <w:rPr>
+          <w:lang w:val="es-ES"/>
+        </w:rPr>
+        <w:t>están</w:t>
+      </w:r>
+      <w:r>
+        <w:rPr>
+          <w:lang w:val="es-ES"/>
+        </w:rPr>
+        <w:t xml:space="preserve"> en la misma red local conectados a </w:t>
+      </w:r>
+      <w:r>
+        <w:rPr>
+          <w:lang w:val="es-ES"/>
+        </w:rPr>
+        <w:t>través</w:t>
+      </w:r>
+      <w:r>
+        <w:rPr>
+          <w:lang w:val="es-ES"/>
+        </w:rPr>
+        <w:t xml:space="preserve"> de un switch. Por </w:t>
+      </w:r>
+      <w:r>
+        <w:rPr>
+          <w:lang w:val="es-ES"/>
+        </w:rPr>
+        <w:t>tanto,</w:t>
+      </w:r>
+      <w:r>
+        <w:rPr>
+          <w:lang w:val="es-ES"/>
+        </w:rPr>
+        <w:t xml:space="preserve"> ambos deben usar la misma mascara: /25 (255.255.255.128).</w:t>
+      </w:r>
+    </w:p>
+    <w:p>
+      <w:pPr>
+        <w:pStyle w:val="Sinespaciado"/>
+        <w:rPr>
+          <w:lang w:val="es-ES"/>
+        </w:rPr>
+      </w:pPr>
+      <w:r>
+        <w:rPr>
+          <w:lang w:val="es-ES"/>
+        </w:rPr>
+        <w:t xml:space="preserve">Con una </w:t>
+      </w:r>
+      <w:r>
+        <w:rPr>
+          <w:lang w:val="es-ES"/>
+        </w:rPr>
+        <w:t>máscara</w:t>
+      </w:r>
+      <w:r>
+        <w:rPr>
+          <w:lang w:val="es-ES"/>
+        </w:rPr>
+        <w:t xml:space="preserve"> /25 los bits de host son 32 - 25 = 7, lo que da 2^7 - 2 = 126 hosts </w:t>
+      </w:r>
+      <w:r>
+        <w:rPr>
+          <w:lang w:val="es-ES"/>
+        </w:rPr>
+        <w:t>válidos</w:t>
+      </w:r>
+      <w:r>
+        <w:rPr>
+          <w:lang w:val="es-ES"/>
+        </w:rPr>
+        <w:t xml:space="preserve">. La red en este caso es 45.149.96.128/25, por lo que el rango valido de </w:t>
+      </w:r>
+      <w:proofErr w:type="spellStart"/>
+      <w:r>
+        <w:rPr>
+          <w:lang w:val="es-ES"/>
+        </w:rPr>
+        <w:t>IPs</w:t>
+      </w:r>
+      <w:proofErr w:type="spellEnd"/>
+      <w:r>
+        <w:rPr>
+          <w:lang w:val="es-ES"/>
+        </w:rPr>
+        <w:t xml:space="preserve"> va del 45.149.96.129 al 45.149.96.254.</w:t>
+      </w:r>
+    </w:p>
+    <w:p>
+      <w:pPr>
+        <w:pStyle w:val="Sinespaciado"/>
+        <w:rPr>
+          <w:lang w:val="es-ES"/>
+        </w:rPr>
+      </w:pPr>
+    </w:p>
+    <w:p>
+      <w:pPr>
+        <w:pStyle w:val="Sinespaciado"/>
+        <w:rPr>
+          <w:lang w:val="es-ES"/>
+        </w:rPr>
+      </w:pPr>
+      <w:r>
+        <w:rPr>
+          <w:lang w:val="es-ES"/>
+        </w:rPr>
+        <w:t xml:space="preserve">La interfaz R1 debe tener una IP dentro de ese rango. En este caso se usa 45.149.96.254, que es la </w:t>
+      </w:r>
+      <w:r>
+        <w:rPr>
+          <w:lang w:val="es-ES"/>
+        </w:rPr>
+        <w:t>última</w:t>
+      </w:r>
+      <w:r>
+        <w:rPr>
+          <w:lang w:val="es-ES"/>
+        </w:rPr>
+        <w:t xml:space="preserve"> IP valida antes del broadcast, </w:t>
+      </w:r>
+      <w:r>
+        <w:rPr>
+          <w:lang w:val="es-ES"/>
+        </w:rPr>
+        <w:t>convención</w:t>
+      </w:r>
+      <w:r>
+        <w:rPr>
+          <w:lang w:val="es-ES"/>
+        </w:rPr>
+        <w:t xml:space="preserve"> habitual para interfaces de </w:t>
+      </w:r>
+      <w:proofErr w:type="spellStart"/>
+      <w:r>
+        <w:rPr>
+          <w:lang w:val="es-ES"/>
+        </w:rPr>
+        <w:t>router</w:t>
+      </w:r>
+      <w:proofErr w:type="spellEnd"/>
+      <w:r>
+        <w:rPr>
+          <w:lang w:val="es-ES"/>
+        </w:rPr>
+        <w:t>.</w:t>
+      </w:r>
+    </w:p>
+    <w:p>
+      <w:pPr>
+        <w:pStyle w:val="Sinespaciado"/>
+        <w:rPr>
+          <w:lang w:val="es-ES"/>
+        </w:rPr>
+      </w:pPr>
+    </w:p>
+    <w:p>
+      <w:pPr>
+        <w:pStyle w:val="Sinespaciado"/>
+        <w:rPr>
+          <w:lang w:val="es-ES"/>
+        </w:rPr>
+      </w:pPr>
+      <w:r>
+        <w:rPr>
+          <w:b/>
+          <w:bCs/>
+          <w:lang w:val="es-ES"/>
+        </w:rPr>
+        <w:t>Paso 2 — Tabla de rutas del cliente A</w:t>
+      </w:r>
+    </w:p>
+    <w:p>
+      <w:pPr>
+        <w:pStyle w:val="Sinespaciado"/>
+        <w:rPr>
+          <w:lang w:val="es-ES"/>
+        </w:rPr>
+      </w:pPr>
+      <w:r>
+        <w:rPr>
+          <w:lang w:val="es-ES"/>
+        </w:rPr>
+        <w:t xml:space="preserve">El cliente A necesita saber </w:t>
+      </w:r>
+      <w:r>
+        <w:rPr>
+          <w:lang w:val="es-ES"/>
+        </w:rPr>
+        <w:t>cómo</w:t>
+      </w:r>
+      <w:r>
+        <w:rPr>
+          <w:lang w:val="es-ES"/>
+        </w:rPr>
+        <w:t xml:space="preserve"> llegar a Internet. Su tabla de rutas debe tener:</w:t>
+      </w:r>
+    </w:p>
+    <w:p>
+      <w:pPr>
+        <w:pStyle w:val="Sinespaciado"/>
+        <w:numPr>
+          <w:ilvl w:val="0"/>
+          <w:numId w:val="5"/>
+        </w:numPr>
+        <w:rPr>
+          <w:lang w:val="es-ES"/>
+        </w:rPr>
+      </w:pPr>
+      <w:r>
+        <w:rPr>
+          <w:lang w:val="es-ES"/>
+        </w:rPr>
+        <w:t>Destino: 0.0.0.0/0 (ruta por defecto, cualquier destino desconocido)</w:t>
+      </w:r>
+    </w:p>
+    <w:p>
+      <w:pPr>
+        <w:pStyle w:val="Sinespaciado"/>
+        <w:numPr>
+          <w:ilvl w:val="0"/>
+          <w:numId w:val="5"/>
+        </w:numPr>
+        <w:rPr>
+          <w:lang w:val="es-ES"/>
+        </w:rPr>
+      </w:pPr>
+      <w:r>
+        <w:rPr>
+          <w:lang w:val="es-ES"/>
+        </w:rPr>
+        <w:t xml:space="preserve">Siguiente salto: 45.149.96.254 (la IP de R1, el </w:t>
+      </w:r>
+      <w:proofErr w:type="spellStart"/>
+      <w:r>
+        <w:rPr>
+          <w:lang w:val="es-ES"/>
+        </w:rPr>
+        <w:t>router</w:t>
+      </w:r>
+      <w:proofErr w:type="spellEnd"/>
+      <w:r>
+        <w:rPr>
+          <w:lang w:val="es-ES"/>
+        </w:rPr>
+        <w:t xml:space="preserve"> que tiene salida hacia Internet)</w:t>
+      </w:r>
+    </w:p>
+    <w:p>
+      <w:pPr>
+        <w:pStyle w:val="Sinespaciado"/>
+        <w:rPr>
+          <w:lang w:val="es-ES"/>
+        </w:rPr>
+      </w:pPr>
+      <w:r>
+        <w:rPr>
+          <w:lang w:val="es-ES"/>
+        </w:rPr>
+        <w:t xml:space="preserve">Alternativamente se puede poner como destino la IP especifica 8.8.8.8/16, pero usar la ruta por defecto es </w:t>
+      </w:r>
+      <w:r>
+        <w:rPr>
+          <w:lang w:val="es-ES"/>
+        </w:rPr>
+        <w:t>más</w:t>
+      </w:r>
+      <w:r>
+        <w:rPr>
+          <w:lang w:val="es-ES"/>
+        </w:rPr>
+        <w:t xml:space="preserve"> limpio y funciona igual.</w:t>
+      </w:r>
+    </w:p>
+    <w:p>
+      <w:pPr>
+        <w:pStyle w:val="Sinespaciado"/>
+        <w:rPr>
+          <w:lang w:val="es-ES"/>
+        </w:rPr>
+      </w:pPr>
+    </w:p>
+    <w:p>
+      <w:pPr>
+        <w:pStyle w:val="Sinespaciado"/>
+        <w:rPr>
+          <w:lang w:val="es-ES"/>
+        </w:rPr>
+      </w:pPr>
+      <w:r>
+        <w:rPr>
+          <w:b/>
+          <w:bCs/>
+          <w:lang w:val="es-ES"/>
+        </w:rPr>
+        <w:t>Paso 3 — Tabla de rutas de Internet</w:t>
+      </w:r>
+    </w:p>
+    <w:p>
+      <w:pPr>
+        <w:pStyle w:val="Sinespaciado"/>
+        <w:rPr>
+          <w:lang w:val="es-ES"/>
+        </w:rPr>
+      </w:pPr>
+      <w:r>
+        <w:rPr>
+          <w:lang w:val="es-ES"/>
+        </w:rPr>
+        <w:t xml:space="preserve">Internet </w:t>
+      </w:r>
+      <w:r>
+        <w:rPr>
+          <w:lang w:val="es-ES"/>
+        </w:rPr>
+        <w:t>también</w:t>
+      </w:r>
+      <w:r>
+        <w:rPr>
+          <w:lang w:val="es-ES"/>
+        </w:rPr>
+        <w:t xml:space="preserve"> necesita saber </w:t>
+      </w:r>
+      <w:r>
+        <w:rPr>
+          <w:lang w:val="es-ES"/>
+        </w:rPr>
+        <w:t>cómo</w:t>
+      </w:r>
+      <w:r>
+        <w:rPr>
+          <w:lang w:val="es-ES"/>
+        </w:rPr>
+        <w:t xml:space="preserve"> llegar de vuelta al cliente A. Su tabla de rutas debe tener:</w:t>
+      </w:r>
+    </w:p>
+    <w:p>
+      <w:pPr>
+        <w:pStyle w:val="Sinespaciado"/>
+        <w:numPr>
+          <w:ilvl w:val="0"/>
+          <w:numId w:val="6"/>
+        </w:numPr>
+        <w:rPr>
+          <w:lang w:val="es-ES"/>
+        </w:rPr>
+      </w:pPr>
+      <w:r>
+        <w:rPr>
+          <w:lang w:val="es-ES"/>
+        </w:rPr>
+        <w:t xml:space="preserve">Destino: 45.149.96.227/25 o 0.0.0.0/0 (la red donde </w:t>
+      </w:r>
+      <w:r>
+        <w:rPr>
+          <w:lang w:val="es-ES"/>
+        </w:rPr>
+        <w:t>está</w:t>
+      </w:r>
+      <w:r>
+        <w:rPr>
+          <w:lang w:val="es-ES"/>
+        </w:rPr>
+        <w:t xml:space="preserve"> el cliente A)</w:t>
+      </w:r>
+    </w:p>
+    <w:p>
+      <w:pPr>
+        <w:pStyle w:val="Sinespaciado"/>
+        <w:numPr>
+          <w:ilvl w:val="0"/>
+          <w:numId w:val="6"/>
+        </w:numPr>
+        <w:rPr>
+          <w:lang w:val="es-ES"/>
+        </w:rPr>
+      </w:pPr>
+      <w:r>
+        <w:rPr>
+          <w:lang w:val="es-ES"/>
+        </w:rPr>
+        <w:t xml:space="preserve">Siguiente salto: la interfaz R2 del </w:t>
+      </w:r>
+      <w:proofErr w:type="spellStart"/>
+      <w:r>
+        <w:rPr>
+          <w:lang w:val="es-ES"/>
+        </w:rPr>
+        <w:t>router</w:t>
+      </w:r>
+      <w:proofErr w:type="spellEnd"/>
+      <w:r>
+        <w:rPr>
+          <w:lang w:val="es-ES"/>
+        </w:rPr>
+        <w:t xml:space="preserve"> (el punto de entrada desde Internet hacia la red local)</w:t>
+      </w:r>
+      <w:r>
+        <w:rPr>
+          <w:lang w:val="es-ES"/>
+        </w:rPr>
+        <w:t>.</w:t>
+      </w:r>
+    </w:p>
+    <w:p>
+      <w:pPr>
+        <w:pStyle w:val="Sinespaciado"/>
+        <w:rPr>
+          <w:lang w:val="es-ES"/>
+        </w:rPr>
+      </w:pPr>
+    </w:p>
+    <w:p>
+      <w:pPr>
+        <w:pStyle w:val="Sinespaciado"/>
+        <w:rPr>
+          <w:lang w:val="es-ES"/>
+        </w:rPr>
+      </w:pPr>
+      <w:r>
+        <w:rPr>
+          <w:b/>
+          <w:bCs/>
+          <w:lang w:val="es-ES"/>
+        </w:rPr>
+        <w:t xml:space="preserve">Paso 4 — Tabla de rutas del </w:t>
+      </w:r>
+      <w:proofErr w:type="spellStart"/>
+      <w:r>
+        <w:rPr>
+          <w:b/>
+          <w:bCs/>
+          <w:lang w:val="es-ES"/>
+        </w:rPr>
+        <w:t>router</w:t>
+      </w:r>
+      <w:proofErr w:type="spellEnd"/>
+      <w:r>
+        <w:rPr>
+          <w:b/>
+          <w:bCs/>
+          <w:lang w:val="es-ES"/>
+        </w:rPr>
+        <w:t xml:space="preserve"> R</w:t>
+      </w:r>
+    </w:p>
+    <w:p>
+      <w:pPr>
+        <w:pStyle w:val="Sinespaciado"/>
+        <w:rPr>
+          <w:lang w:val="es-ES"/>
+        </w:rPr>
+      </w:pPr>
+      <w:r>
+        <w:rPr>
+          <w:lang w:val="es-ES"/>
+        </w:rPr>
+        <w:t xml:space="preserve">La tabla de rutas del </w:t>
+      </w:r>
+      <w:proofErr w:type="spellStart"/>
+      <w:r>
+        <w:rPr>
+          <w:lang w:val="es-ES"/>
+        </w:rPr>
+        <w:t>router</w:t>
+      </w:r>
+      <w:proofErr w:type="spellEnd"/>
+      <w:r>
+        <w:rPr>
+          <w:lang w:val="es-ES"/>
+        </w:rPr>
+        <w:t xml:space="preserve"> tiene un siguiente salto que no coincide con ninguna interfaz del esquema. En ese caso se puede poner el destino como 0.0.0.0/0 sin que afecte al resto de conexiones.</w:t>
+      </w:r>
+    </w:p>
+    <w:p>
+      <w:pPr>
+        <w:pStyle w:val="Sinespaciado"/>
+      </w:pPr>
+    </w:p>
+    <w:p>
+      <w:pPr>
+        <w:pStyle w:val="Sinespaciado"/>
+        <w:rPr>
+          <w:lang w:val="es-ES"/>
+        </w:rPr>
+      </w:pPr>
+      <w:r>
+        <w:rPr>
+          <w:b/>
+          <w:bCs/>
+          <w:lang w:val="es-ES"/>
+        </w:rPr>
+        <w:t>Concepto clave de este nivel</w:t>
+      </w:r>
+    </w:p>
+    <w:p>
+      <w:pPr>
+        <w:pStyle w:val="Sinespaciado"/>
+        <w:rPr>
+          <w:lang w:val="es-ES"/>
+        </w:rPr>
+      </w:pPr>
+      <w:r>
+        <w:rPr>
+          <w:lang w:val="es-ES"/>
+        </w:rPr>
+        <w:t xml:space="preserve">La </w:t>
+      </w:r>
+      <w:r>
+        <w:rPr>
+          <w:lang w:val="es-ES"/>
+        </w:rPr>
+        <w:t>comunicación</w:t>
+      </w:r>
+      <w:r>
+        <w:rPr>
+          <w:lang w:val="es-ES"/>
+        </w:rPr>
+        <w:t xml:space="preserve"> en red es siempre bidireccional. No basta con que A sepa llegar a Internet, Internet </w:t>
+      </w:r>
+      <w:r>
+        <w:rPr>
+          <w:lang w:val="es-ES"/>
+        </w:rPr>
+        <w:t>también</w:t>
+      </w:r>
+      <w:r>
+        <w:rPr>
+          <w:lang w:val="es-ES"/>
+        </w:rPr>
+        <w:t xml:space="preserve"> necesita saber </w:t>
+      </w:r>
+      <w:r>
+        <w:rPr>
+          <w:lang w:val="es-ES"/>
+        </w:rPr>
+        <w:t>cómo</w:t>
+      </w:r>
+      <w:r>
+        <w:rPr>
+          <w:lang w:val="es-ES"/>
+        </w:rPr>
+        <w:t xml:space="preserve"> volver a </w:t>
+      </w:r>
+      <w:proofErr w:type="spellStart"/>
+      <w:r>
+        <w:rPr>
+          <w:lang w:val="es-ES"/>
+        </w:rPr>
+        <w:t>A</w:t>
+      </w:r>
+      <w:proofErr w:type="spellEnd"/>
+      <w:r>
+        <w:rPr>
+          <w:lang w:val="es-ES"/>
+        </w:rPr>
+        <w:t xml:space="preserve">. Si falta cualquiera de las dos rutas, la </w:t>
+      </w:r>
+      <w:r>
+        <w:rPr>
+          <w:lang w:val="es-ES"/>
+        </w:rPr>
+        <w:t>conexión</w:t>
+      </w:r>
+      <w:r>
+        <w:rPr>
+          <w:lang w:val="es-ES"/>
+        </w:rPr>
+        <w:t xml:space="preserve"> no funciona.</w:t>
+      </w:r>
+    </w:p>
+    <w:p>
+      <w:pPr>
+        <w:pStyle w:val="Sinespaciado"/>
+        <w:rPr>
+          <w:lang w:val="es-ES"/>
+        </w:rPr>
+      </w:pPr>
+    </w:p>
+    <w:p>
+      <w:pPr>
+        <w:pStyle w:val="Ttulo2"/>
+        <w:pageBreakBefore/>
+        <w:rPr>
+          <w:lang w:val="es-ES"/>
+        </w:rPr>
+      </w:pPr>
+      <w:bookmarkStart w:id="16" w:name="_Toc227661434"/>
+      <w:r>
+        <w:rPr>
+          <w:lang w:val="es-ES"/>
+        </w:rPr>
+        <w:lastRenderedPageBreak/>
+        <w:t xml:space="preserve">Nivel </w:t>
+      </w:r>
+      <w:r>
+        <w:rPr>
+          <w:lang w:val="es-ES"/>
+        </w:rPr>
+        <w:t xml:space="preserve">7 </w:t>
+      </w:r>
+      <w:r>
+        <w:rPr>
+          <w:lang w:val="es-ES"/>
+        </w:rPr>
+        <w:t xml:space="preserve">— Redes separadas y el concepto de </w:t>
+      </w:r>
+      <w:proofErr w:type="spellStart"/>
+      <w:r>
+        <w:rPr>
+          <w:lang w:val="es-ES"/>
+        </w:rPr>
+        <w:t>overlapping</w:t>
+      </w:r>
+      <w:bookmarkEnd w:id="16"/>
+      <w:proofErr w:type="spellEnd"/>
+    </w:p>
+    <w:p>
+      <w:pPr>
+        <w:pStyle w:val="Sinespaciado"/>
+        <w:rPr>
+          <w:lang w:val="es-ES"/>
+        </w:rPr>
+      </w:pPr>
+      <w:r>
+        <w:rPr>
+          <w:lang w:val="es-ES"/>
+        </w:rPr>
+        <w:t xml:space="preserve">Este nivel introduce un concepto fundamental: cuando tienes varias redes conectadas a </w:t>
+      </w:r>
+      <w:proofErr w:type="spellStart"/>
+      <w:r>
+        <w:rPr>
+          <w:lang w:val="es-ES"/>
+        </w:rPr>
+        <w:t>traves</w:t>
+      </w:r>
+      <w:proofErr w:type="spellEnd"/>
+      <w:r>
+        <w:rPr>
+          <w:lang w:val="es-ES"/>
+        </w:rPr>
+        <w:t xml:space="preserve"> de </w:t>
+      </w:r>
+      <w:proofErr w:type="spellStart"/>
+      <w:r>
+        <w:rPr>
+          <w:lang w:val="es-ES"/>
+        </w:rPr>
+        <w:t>routers</w:t>
+      </w:r>
+      <w:proofErr w:type="spellEnd"/>
+      <w:r>
+        <w:rPr>
+          <w:lang w:val="es-ES"/>
+        </w:rPr>
+        <w:t xml:space="preserve">, cada red debe tener su propio rango de </w:t>
+      </w:r>
+      <w:proofErr w:type="spellStart"/>
+      <w:r>
+        <w:rPr>
+          <w:lang w:val="es-ES"/>
+        </w:rPr>
+        <w:t>IPs</w:t>
+      </w:r>
+      <w:proofErr w:type="spellEnd"/>
+      <w:r>
+        <w:rPr>
+          <w:lang w:val="es-ES"/>
+        </w:rPr>
+        <w:t xml:space="preserve"> sin solaparse con las </w:t>
+      </w:r>
+      <w:proofErr w:type="spellStart"/>
+      <w:r>
+        <w:rPr>
+          <w:lang w:val="es-ES"/>
+        </w:rPr>
+        <w:t>demas</w:t>
+      </w:r>
+      <w:proofErr w:type="spellEnd"/>
+      <w:r>
+        <w:rPr>
+          <w:lang w:val="es-ES"/>
+        </w:rPr>
+        <w:t xml:space="preserve">. Si dos redes comparten </w:t>
+      </w:r>
+      <w:proofErr w:type="spellStart"/>
+      <w:r>
+        <w:rPr>
+          <w:lang w:val="es-ES"/>
+        </w:rPr>
+        <w:t>IPs</w:t>
+      </w:r>
+      <w:proofErr w:type="spellEnd"/>
+      <w:r>
+        <w:rPr>
+          <w:lang w:val="es-ES"/>
+        </w:rPr>
+        <w:t xml:space="preserve">, el </w:t>
+      </w:r>
+      <w:proofErr w:type="spellStart"/>
+      <w:r>
+        <w:rPr>
+          <w:lang w:val="es-ES"/>
+        </w:rPr>
+        <w:t>router</w:t>
+      </w:r>
+      <w:proofErr w:type="spellEnd"/>
+      <w:r>
+        <w:rPr>
+          <w:lang w:val="es-ES"/>
+        </w:rPr>
+        <w:t xml:space="preserve"> no </w:t>
+      </w:r>
+      <w:proofErr w:type="spellStart"/>
+      <w:r>
+        <w:rPr>
+          <w:lang w:val="es-ES"/>
+        </w:rPr>
+        <w:t>sabra</w:t>
+      </w:r>
+      <w:proofErr w:type="spellEnd"/>
+      <w:r>
+        <w:rPr>
+          <w:lang w:val="es-ES"/>
+        </w:rPr>
+        <w:t xml:space="preserve"> a </w:t>
+      </w:r>
+      <w:r>
+        <w:rPr>
+          <w:lang w:val="es-ES"/>
+        </w:rPr>
+        <w:t>cuál</w:t>
+      </w:r>
+      <w:r>
+        <w:rPr>
+          <w:lang w:val="es-ES"/>
+        </w:rPr>
+        <w:t xml:space="preserve"> de ellas enviar el paquete y la </w:t>
+      </w:r>
+      <w:proofErr w:type="spellStart"/>
+      <w:r>
+        <w:rPr>
+          <w:lang w:val="es-ES"/>
+        </w:rPr>
+        <w:t>comunicacion</w:t>
+      </w:r>
+      <w:proofErr w:type="spellEnd"/>
+      <w:r>
+        <w:rPr>
+          <w:lang w:val="es-ES"/>
+        </w:rPr>
+        <w:t xml:space="preserve"> fallara.</w:t>
+      </w:r>
+    </w:p>
+    <w:p>
+      <w:pPr>
+        <w:pStyle w:val="Sinespaciado"/>
+        <w:rPr>
+          <w:lang w:val="es-ES"/>
+        </w:rPr>
+      </w:pPr>
+    </w:p>
+    <w:p>
+      <w:pPr>
+        <w:pStyle w:val="Sinespaciado"/>
+        <w:rPr>
+          <w:lang w:val="es-ES"/>
+        </w:rPr>
+      </w:pPr>
+      <w:r>
+        <w:rPr>
+          <w:b/>
+          <w:bCs/>
+          <w:lang w:val="es-ES"/>
+        </w:rPr>
+        <w:t>Identificar las redes del esquema</w:t>
+      </w:r>
+    </w:p>
+    <w:p>
+      <w:pPr>
+        <w:pStyle w:val="Sinespaciado"/>
+        <w:rPr>
+          <w:lang w:val="es-ES"/>
+        </w:rPr>
+      </w:pPr>
+      <w:r>
+        <w:rPr>
+          <w:lang w:val="es-ES"/>
+        </w:rPr>
+        <w:t>Al analizar el diagrama se distinguen tres redes separadas:</w:t>
+      </w:r>
+    </w:p>
+    <w:p>
+      <w:pPr>
+        <w:pStyle w:val="Sinespaciado"/>
+        <w:numPr>
+          <w:ilvl w:val="0"/>
+          <w:numId w:val="7"/>
+        </w:numPr>
+        <w:rPr>
+          <w:lang w:val="es-ES"/>
+        </w:rPr>
+      </w:pPr>
+      <w:r>
+        <w:rPr>
+          <w:b/>
+          <w:bCs/>
+          <w:lang w:val="es-ES"/>
+        </w:rPr>
+        <w:t>Red 1:</w:t>
+      </w:r>
+      <w:r>
+        <w:rPr>
+          <w:lang w:val="es-ES"/>
+        </w:rPr>
+        <w:t xml:space="preserve"> entre la interfaz A1 (cliente A) e interfaz R11 (</w:t>
+      </w:r>
+      <w:proofErr w:type="spellStart"/>
+      <w:r>
+        <w:rPr>
+          <w:lang w:val="es-ES"/>
+        </w:rPr>
+        <w:t>router</w:t>
+      </w:r>
+      <w:proofErr w:type="spellEnd"/>
+      <w:r>
+        <w:rPr>
+          <w:lang w:val="es-ES"/>
+        </w:rPr>
+        <w:t xml:space="preserve"> R1)</w:t>
+      </w:r>
+    </w:p>
+    <w:p>
+      <w:pPr>
+        <w:pStyle w:val="Sinespaciado"/>
+        <w:numPr>
+          <w:ilvl w:val="0"/>
+          <w:numId w:val="7"/>
+        </w:numPr>
+      </w:pPr>
+      <w:r>
+        <w:rPr>
+          <w:b/>
+          <w:bCs/>
+        </w:rPr>
+        <w:t>Red 2:</w:t>
+      </w:r>
+      <w:r>
+        <w:t xml:space="preserve"> entre la </w:t>
+      </w:r>
+      <w:proofErr w:type="spellStart"/>
+      <w:r>
+        <w:t>interfaz</w:t>
+      </w:r>
+      <w:proofErr w:type="spellEnd"/>
+      <w:r>
+        <w:t xml:space="preserve"> R12 (router R1) e </w:t>
+      </w:r>
+      <w:proofErr w:type="spellStart"/>
+      <w:r>
+        <w:t>interfaz</w:t>
+      </w:r>
+      <w:proofErr w:type="spellEnd"/>
+      <w:r>
+        <w:t xml:space="preserve"> R21 (router R2)</w:t>
+      </w:r>
+    </w:p>
+    <w:p>
+      <w:pPr>
+        <w:pStyle w:val="Sinespaciado"/>
+        <w:numPr>
+          <w:ilvl w:val="0"/>
+          <w:numId w:val="7"/>
+        </w:numPr>
+        <w:rPr>
+          <w:lang w:val="es-ES"/>
+        </w:rPr>
+      </w:pPr>
+      <w:r>
+        <w:rPr>
+          <w:b/>
+          <w:bCs/>
+          <w:lang w:val="es-ES"/>
+        </w:rPr>
+        <w:t>Red 3:</w:t>
+      </w:r>
+      <w:r>
+        <w:rPr>
+          <w:lang w:val="es-ES"/>
+        </w:rPr>
+        <w:t xml:space="preserve"> entre la interfaz R22 (</w:t>
+      </w:r>
+      <w:proofErr w:type="spellStart"/>
+      <w:r>
+        <w:rPr>
+          <w:lang w:val="es-ES"/>
+        </w:rPr>
+        <w:t>router</w:t>
+      </w:r>
+      <w:proofErr w:type="spellEnd"/>
+      <w:r>
+        <w:rPr>
+          <w:lang w:val="es-ES"/>
+        </w:rPr>
+        <w:t xml:space="preserve"> R2) e interfaz C1 (cliente C)</w:t>
+      </w:r>
+    </w:p>
+    <w:p>
+      <w:pPr>
+        <w:pStyle w:val="Sinespaciado"/>
+      </w:pPr>
+    </w:p>
+    <w:p>
+      <w:pPr>
+        <w:pStyle w:val="Sinespaciado"/>
+        <w:rPr>
+          <w:lang w:val="es-ES"/>
+        </w:rPr>
+      </w:pPr>
+      <w:r>
+        <w:rPr>
+          <w:lang w:val="es-ES"/>
+        </w:rPr>
+        <w:t xml:space="preserve">Cada una de estas redes es independiente y debe tener su propio rango de </w:t>
+      </w:r>
+      <w:proofErr w:type="spellStart"/>
+      <w:r>
+        <w:rPr>
+          <w:lang w:val="es-ES"/>
+        </w:rPr>
+        <w:t>IPs</w:t>
+      </w:r>
+      <w:proofErr w:type="spellEnd"/>
+      <w:r>
+        <w:rPr>
+          <w:lang w:val="es-ES"/>
+        </w:rPr>
+        <w:t xml:space="preserve">. Un mismo </w:t>
+      </w:r>
+      <w:proofErr w:type="spellStart"/>
+      <w:r>
+        <w:rPr>
+          <w:lang w:val="es-ES"/>
+        </w:rPr>
+        <w:t>router</w:t>
+      </w:r>
+      <w:proofErr w:type="spellEnd"/>
+      <w:r>
+        <w:rPr>
+          <w:lang w:val="es-ES"/>
+        </w:rPr>
+        <w:t xml:space="preserve"> no puede tener dos interfaces con </w:t>
+      </w:r>
+      <w:proofErr w:type="spellStart"/>
+      <w:r>
+        <w:rPr>
+          <w:lang w:val="es-ES"/>
+        </w:rPr>
+        <w:t>IPs</w:t>
+      </w:r>
+      <w:proofErr w:type="spellEnd"/>
+      <w:r>
+        <w:rPr>
+          <w:lang w:val="es-ES"/>
+        </w:rPr>
+        <w:t xml:space="preserve"> del mismo rango porque no </w:t>
+      </w:r>
+      <w:proofErr w:type="spellStart"/>
+      <w:r>
+        <w:rPr>
+          <w:lang w:val="es-ES"/>
+        </w:rPr>
+        <w:t>sabria</w:t>
+      </w:r>
+      <w:proofErr w:type="spellEnd"/>
+      <w:r>
+        <w:rPr>
+          <w:lang w:val="es-ES"/>
+        </w:rPr>
+        <w:t xml:space="preserve"> distinguir a que red pertenece cada paquete.</w:t>
+      </w:r>
+    </w:p>
+    <w:p>
+      <w:pPr>
+        <w:pStyle w:val="Sinespaciado"/>
+        <w:rPr>
+          <w:lang w:val="es-ES"/>
+        </w:rPr>
+      </w:pPr>
+    </w:p>
+    <w:p>
+      <w:pPr>
+        <w:pStyle w:val="Sinespaciado"/>
+        <w:rPr>
+          <w:b/>
+          <w:bCs/>
+          <w:lang w:val="es-ES"/>
+        </w:rPr>
+      </w:pPr>
+      <w:r>
+        <w:rPr>
+          <w:b/>
+          <w:bCs/>
+          <w:lang w:val="es-ES"/>
+        </w:rPr>
+        <w:t>Elegir la mascara</w:t>
+      </w:r>
+    </w:p>
+    <w:p>
+      <w:pPr>
+        <w:pStyle w:val="Sinespaciado"/>
+        <w:rPr>
+          <w:lang w:val="es-ES"/>
+        </w:rPr>
+      </w:pPr>
+    </w:p>
+    <w:p>
+      <w:pPr>
+        <w:pStyle w:val="Sinespaciado"/>
+        <w:rPr>
+          <w:lang w:val="es-ES"/>
+        </w:rPr>
+      </w:pPr>
+      <w:r>
+        <w:rPr>
+          <w:lang w:val="es-ES"/>
+        </w:rPr>
+        <w:t xml:space="preserve">Como las </w:t>
+      </w:r>
+      <w:proofErr w:type="spellStart"/>
+      <w:r>
+        <w:rPr>
+          <w:lang w:val="es-ES"/>
+        </w:rPr>
+        <w:t>IPs</w:t>
+      </w:r>
+      <w:proofErr w:type="spellEnd"/>
+      <w:r>
+        <w:rPr>
+          <w:lang w:val="es-ES"/>
+        </w:rPr>
+        <w:t xml:space="preserve"> de las interfaces de R1 ya </w:t>
+      </w:r>
+      <w:proofErr w:type="spellStart"/>
+      <w:r>
+        <w:rPr>
+          <w:lang w:val="es-ES"/>
+        </w:rPr>
+        <w:t>estan</w:t>
+      </w:r>
+      <w:proofErr w:type="spellEnd"/>
+      <w:r>
+        <w:rPr>
+          <w:lang w:val="es-ES"/>
+        </w:rPr>
+        <w:t xml:space="preserve"> fijadas, hay que elegir mascaras que permitan dividir el espacio de direcciones en subredes pequeñas sin que se solapen. Una buena </w:t>
+      </w:r>
+      <w:proofErr w:type="spellStart"/>
+      <w:r>
+        <w:rPr>
+          <w:lang w:val="es-ES"/>
+        </w:rPr>
+        <w:t>opcion</w:t>
+      </w:r>
+      <w:proofErr w:type="spellEnd"/>
+      <w:r>
+        <w:rPr>
+          <w:lang w:val="es-ES"/>
+        </w:rPr>
+        <w:t xml:space="preserve"> es /28, que da 16 </w:t>
+      </w:r>
+      <w:proofErr w:type="spellStart"/>
+      <w:r>
+        <w:rPr>
+          <w:lang w:val="es-ES"/>
+        </w:rPr>
+        <w:t>IPs</w:t>
+      </w:r>
+      <w:proofErr w:type="spellEnd"/>
+      <w:r>
+        <w:rPr>
+          <w:lang w:val="es-ES"/>
+        </w:rPr>
+        <w:t xml:space="preserve"> por subred (14 hosts validos), </w:t>
+      </w:r>
+      <w:proofErr w:type="spellStart"/>
+      <w:r>
+        <w:rPr>
+          <w:lang w:val="es-ES"/>
+        </w:rPr>
+        <w:t>mas</w:t>
+      </w:r>
+      <w:proofErr w:type="spellEnd"/>
+      <w:r>
+        <w:rPr>
+          <w:lang w:val="es-ES"/>
+        </w:rPr>
+        <w:t xml:space="preserve"> que suficiente para este escenario.</w:t>
+      </w:r>
+    </w:p>
+    <w:p>
+      <w:pPr>
+        <w:pStyle w:val="Sinespaciado"/>
+        <w:rPr>
+          <w:lang w:val="es-ES"/>
+        </w:rPr>
+      </w:pPr>
+      <w:r>
+        <w:rPr>
+          <w:lang w:val="es-ES"/>
+        </w:rPr>
+        <w:t>No es obligatorio usar la misma mascara en todas las redes. Cada red puede tener la suya propia siempre que no haya solapamiento.</w:t>
+      </w:r>
+    </w:p>
+    <w:p>
+      <w:pPr>
+        <w:pStyle w:val="Sinespaciado"/>
+        <w:rPr>
+          <w:lang w:val="es-ES"/>
+        </w:rPr>
+      </w:pPr>
+    </w:p>
+    <w:p>
+      <w:pPr>
+        <w:pStyle w:val="Sinespaciado"/>
+        <w:rPr>
+          <w:b/>
+          <w:bCs/>
+          <w:lang w:val="es-ES"/>
+        </w:rPr>
+      </w:pPr>
+      <w:r>
+        <w:rPr>
+          <w:b/>
+          <w:bCs/>
+          <w:lang w:val="es-ES"/>
+        </w:rPr>
+        <w:t xml:space="preserve">Asignar </w:t>
+      </w:r>
+      <w:proofErr w:type="spellStart"/>
+      <w:r>
+        <w:rPr>
+          <w:b/>
+          <w:bCs/>
+          <w:lang w:val="es-ES"/>
+        </w:rPr>
+        <w:t>IPs</w:t>
+      </w:r>
+      <w:proofErr w:type="spellEnd"/>
+      <w:r>
+        <w:rPr>
+          <w:b/>
+          <w:bCs/>
+          <w:lang w:val="es-ES"/>
+        </w:rPr>
+        <w:t xml:space="preserve"> a cada red con /28</w:t>
+      </w:r>
+    </w:p>
+    <w:p>
+      <w:pPr>
+        <w:pStyle w:val="Sinespaciado"/>
+        <w:rPr>
+          <w:lang w:val="es-ES"/>
+        </w:rPr>
+      </w:pPr>
+    </w:p>
+    <w:p>
+      <w:pPr>
+        <w:pStyle w:val="Sinespaciado"/>
+        <w:rPr>
+          <w:lang w:val="es-ES"/>
+        </w:rPr>
+      </w:pPr>
+      <w:r>
+        <w:rPr>
+          <w:lang w:val="es-ES"/>
+        </w:rPr>
+        <w:t xml:space="preserve">Con mascara /28 cada subred ocupa un bloque de 16 </w:t>
+      </w:r>
+      <w:proofErr w:type="spellStart"/>
+      <w:r>
+        <w:rPr>
+          <w:lang w:val="es-ES"/>
+        </w:rPr>
+        <w:t>IPs</w:t>
+      </w:r>
+      <w:proofErr w:type="spellEnd"/>
+      <w:r>
+        <w:rPr>
+          <w:lang w:val="es-ES"/>
+        </w:rPr>
+        <w:t xml:space="preserve">. Hay que elegir bloques que no se pisen entre </w:t>
+      </w:r>
+      <w:proofErr w:type="spellStart"/>
+      <w:r>
+        <w:rPr>
+          <w:lang w:val="es-ES"/>
+        </w:rPr>
+        <w:t>si</w:t>
+      </w:r>
+      <w:proofErr w:type="spellEnd"/>
+      <w:r>
+        <w:rPr>
+          <w:lang w:val="es-ES"/>
+        </w:rPr>
+        <w:t>:</w:t>
+      </w:r>
+    </w:p>
+    <w:p>
+      <w:pPr>
+        <w:pStyle w:val="Sinespaciado"/>
+        <w:numPr>
+          <w:ilvl w:val="0"/>
+          <w:numId w:val="8"/>
+        </w:numPr>
+      </w:pPr>
+      <w:r>
+        <w:rPr>
+          <w:b/>
+          <w:bCs/>
+        </w:rPr>
+        <w:t>Red 1:</w:t>
+      </w:r>
+      <w:r>
+        <w:t xml:space="preserve"> </w:t>
+      </w:r>
+      <w:proofErr w:type="spellStart"/>
+      <w:r>
+        <w:t>bloque</w:t>
+      </w:r>
+      <w:proofErr w:type="spellEnd"/>
+      <w:r>
+        <w:t xml:space="preserve"> 119.198.14.0 — 119.198.14.15 </w:t>
+      </w:r>
+    </w:p>
+    <w:p>
+      <w:pPr>
+        <w:pStyle w:val="Sinespaciado"/>
+        <w:numPr>
+          <w:ilvl w:val="1"/>
+          <w:numId w:val="8"/>
+        </w:numPr>
+      </w:pPr>
+      <w:proofErr w:type="spellStart"/>
+      <w:r>
+        <w:t>Direccion</w:t>
+      </w:r>
+      <w:proofErr w:type="spellEnd"/>
+      <w:r>
+        <w:t xml:space="preserve"> de red: 119.198.14.0 (</w:t>
+      </w:r>
+      <w:proofErr w:type="spellStart"/>
+      <w:r>
+        <w:t>reservada</w:t>
+      </w:r>
+      <w:proofErr w:type="spellEnd"/>
+      <w:r>
+        <w:t>)</w:t>
+      </w:r>
+    </w:p>
+    <w:p>
+      <w:pPr>
+        <w:pStyle w:val="Sinespaciado"/>
+        <w:numPr>
+          <w:ilvl w:val="1"/>
+          <w:numId w:val="8"/>
+        </w:numPr>
+      </w:pPr>
+      <w:r>
+        <w:t>Broadcast: 119.198.14.15 (</w:t>
+      </w:r>
+      <w:proofErr w:type="spellStart"/>
+      <w:r>
+        <w:t>reservada</w:t>
+      </w:r>
+      <w:proofErr w:type="spellEnd"/>
+      <w:r>
+        <w:t>)</w:t>
+      </w:r>
+    </w:p>
+    <w:p>
+      <w:pPr>
+        <w:pStyle w:val="Sinespaciado"/>
+        <w:numPr>
+          <w:ilvl w:val="1"/>
+          <w:numId w:val="8"/>
+        </w:numPr>
+        <w:rPr>
+          <w:lang w:val="es-ES"/>
+        </w:rPr>
+      </w:pPr>
+      <w:r>
+        <w:rPr>
+          <w:lang w:val="es-ES"/>
+        </w:rPr>
+        <w:t>R11 ya tiene asignada 119.198.14.1, el cliente A puede usar cualquier IP del .2 al .14</w:t>
+      </w:r>
+    </w:p>
+    <w:p>
+      <w:pPr>
+        <w:pStyle w:val="Sinespaciado"/>
+        <w:numPr>
+          <w:ilvl w:val="0"/>
+          <w:numId w:val="8"/>
+        </w:numPr>
+      </w:pPr>
+      <w:r>
+        <w:rPr>
+          <w:b/>
+          <w:bCs/>
+        </w:rPr>
+        <w:t>Red 2:</w:t>
+      </w:r>
+      <w:r>
+        <w:t xml:space="preserve"> </w:t>
+      </w:r>
+      <w:proofErr w:type="spellStart"/>
+      <w:r>
+        <w:t>bloque</w:t>
+      </w:r>
+      <w:proofErr w:type="spellEnd"/>
+      <w:r>
+        <w:t xml:space="preserve"> 119.198.14.240 — 119.198.14.255 </w:t>
+      </w:r>
+    </w:p>
+    <w:p>
+      <w:pPr>
+        <w:pStyle w:val="Sinespaciado"/>
+        <w:numPr>
+          <w:ilvl w:val="1"/>
+          <w:numId w:val="8"/>
+        </w:numPr>
+      </w:pPr>
+      <w:proofErr w:type="spellStart"/>
+      <w:r>
+        <w:t>Direccion</w:t>
+      </w:r>
+      <w:proofErr w:type="spellEnd"/>
+      <w:r>
+        <w:t xml:space="preserve"> de red: 119.198.14.240 (</w:t>
+      </w:r>
+      <w:proofErr w:type="spellStart"/>
+      <w:r>
+        <w:t>reservada</w:t>
+      </w:r>
+      <w:proofErr w:type="spellEnd"/>
+      <w:r>
+        <w:t>)</w:t>
+      </w:r>
+    </w:p>
+    <w:p>
+      <w:pPr>
+        <w:pStyle w:val="Sinespaciado"/>
+        <w:numPr>
+          <w:ilvl w:val="1"/>
+          <w:numId w:val="8"/>
+        </w:numPr>
+      </w:pPr>
+      <w:r>
+        <w:t>Broadcast: 119.198.14.255 (</w:t>
+      </w:r>
+      <w:proofErr w:type="spellStart"/>
+      <w:r>
+        <w:t>reservada</w:t>
+      </w:r>
+      <w:proofErr w:type="spellEnd"/>
+      <w:r>
+        <w:t>)</w:t>
+      </w:r>
+    </w:p>
+    <w:p>
+      <w:pPr>
+        <w:pStyle w:val="Sinespaciado"/>
+        <w:numPr>
+          <w:ilvl w:val="1"/>
+          <w:numId w:val="8"/>
+        </w:numPr>
+        <w:rPr>
+          <w:lang w:val="es-ES"/>
+        </w:rPr>
+      </w:pPr>
+      <w:r>
+        <w:rPr>
+          <w:lang w:val="es-ES"/>
+        </w:rPr>
+        <w:t>R12 ya tiene asignada 119.198.14.254, R21 puede usar cualquier IP del .241 al .253</w:t>
+      </w:r>
+    </w:p>
+    <w:p>
+      <w:pPr>
+        <w:pStyle w:val="Sinespaciado"/>
+        <w:numPr>
+          <w:ilvl w:val="0"/>
+          <w:numId w:val="8"/>
+        </w:numPr>
+      </w:pPr>
+      <w:r>
+        <w:rPr>
+          <w:b/>
+          <w:bCs/>
+        </w:rPr>
+        <w:t>Red 3:</w:t>
+      </w:r>
+      <w:r>
+        <w:t xml:space="preserve"> </w:t>
+      </w:r>
+      <w:proofErr w:type="spellStart"/>
+      <w:r>
+        <w:t>bloque</w:t>
+      </w:r>
+      <w:proofErr w:type="spellEnd"/>
+      <w:r>
+        <w:t xml:space="preserve"> 119.198.14.128 — 119.198.14.143 </w:t>
+      </w:r>
+    </w:p>
+    <w:p>
+      <w:pPr>
+        <w:pStyle w:val="Sinespaciado"/>
+        <w:numPr>
+          <w:ilvl w:val="1"/>
+          <w:numId w:val="8"/>
+        </w:numPr>
+      </w:pPr>
+      <w:proofErr w:type="spellStart"/>
+      <w:r>
+        <w:t>Direccion</w:t>
+      </w:r>
+      <w:proofErr w:type="spellEnd"/>
+      <w:r>
+        <w:t xml:space="preserve"> de red: 119.198.14.128 (</w:t>
+      </w:r>
+      <w:proofErr w:type="spellStart"/>
+      <w:r>
+        <w:t>reservada</w:t>
+      </w:r>
+      <w:proofErr w:type="spellEnd"/>
+      <w:r>
+        <w:t>)</w:t>
+      </w:r>
+    </w:p>
+    <w:p>
+      <w:pPr>
+        <w:pStyle w:val="Sinespaciado"/>
+        <w:numPr>
+          <w:ilvl w:val="1"/>
+          <w:numId w:val="8"/>
+        </w:numPr>
+      </w:pPr>
+      <w:r>
+        <w:t>Broadcast: 119.198.14.143 (</w:t>
+      </w:r>
+      <w:proofErr w:type="spellStart"/>
+      <w:r>
+        <w:t>reservada</w:t>
+      </w:r>
+      <w:proofErr w:type="spellEnd"/>
+      <w:r>
+        <w:t>)</w:t>
+      </w:r>
+    </w:p>
+    <w:p>
+      <w:pPr>
+        <w:pStyle w:val="Sinespaciado"/>
+        <w:numPr>
+          <w:ilvl w:val="1"/>
+          <w:numId w:val="8"/>
+        </w:numPr>
+        <w:rPr>
+          <w:lang w:val="es-ES"/>
+        </w:rPr>
+      </w:pPr>
+      <w:r>
+        <w:rPr>
+          <w:lang w:val="es-ES"/>
+        </w:rPr>
+        <w:t>R22 y C1 pueden usar cualquier IP del .129 al .142</w:t>
+      </w:r>
+    </w:p>
+    <w:p>
+      <w:pPr>
+        <w:pStyle w:val="Sinespaciado"/>
+      </w:pPr>
+    </w:p>
+    <w:p>
+      <w:pPr>
+        <w:pStyle w:val="Sinespaciado"/>
+        <w:pageBreakBefore/>
+        <w:rPr>
+          <w:lang w:val="es-ES"/>
+        </w:rPr>
+      </w:pPr>
+      <w:r>
+        <w:rPr>
+          <w:b/>
+          <w:bCs/>
+          <w:lang w:val="es-ES"/>
+        </w:rPr>
+        <w:lastRenderedPageBreak/>
+        <w:t>Configurar las tablas de rutas</w:t>
+      </w:r>
+    </w:p>
+    <w:p>
+      <w:pPr>
+        <w:pStyle w:val="Sinespaciado"/>
+        <w:rPr>
+          <w:lang w:val="es-ES"/>
+        </w:rPr>
+      </w:pPr>
+    </w:p>
+    <w:p>
+      <w:pPr>
+        <w:pStyle w:val="Sinespaciado"/>
+        <w:rPr>
+          <w:lang w:val="es-ES"/>
+        </w:rPr>
+      </w:pPr>
+      <w:r>
+        <w:rPr>
+          <w:lang w:val="es-ES"/>
+        </w:rPr>
+        <w:t xml:space="preserve">Una vez asignadas las </w:t>
+      </w:r>
+      <w:proofErr w:type="spellStart"/>
+      <w:r>
+        <w:rPr>
+          <w:lang w:val="es-ES"/>
+        </w:rPr>
+        <w:t>IPs</w:t>
+      </w:r>
+      <w:proofErr w:type="spellEnd"/>
+      <w:r>
+        <w:rPr>
+          <w:lang w:val="es-ES"/>
+        </w:rPr>
+        <w:t xml:space="preserve"> hay que asegurarse de que los paquetes pueden viajar en ambas direcciones:</w:t>
+      </w:r>
+    </w:p>
+    <w:p>
+      <w:pPr>
+        <w:pStyle w:val="Sinespaciado"/>
+        <w:numPr>
+          <w:ilvl w:val="0"/>
+          <w:numId w:val="9"/>
+        </w:numPr>
+        <w:rPr>
+          <w:lang w:val="es-ES"/>
+        </w:rPr>
+      </w:pPr>
+      <w:r>
+        <w:rPr>
+          <w:b/>
+          <w:bCs/>
+          <w:lang w:val="es-ES"/>
+        </w:rPr>
+        <w:t>Cliente A</w:t>
+      </w:r>
+      <w:r>
+        <w:rPr>
+          <w:lang w:val="es-ES"/>
+        </w:rPr>
+        <w:t xml:space="preserve"> necesita una ruta hacia C1. Su siguiente salto es R11 (la interfaz del </w:t>
+      </w:r>
+      <w:proofErr w:type="spellStart"/>
+      <w:r>
+        <w:rPr>
+          <w:lang w:val="es-ES"/>
+        </w:rPr>
+        <w:t>router</w:t>
+      </w:r>
+      <w:proofErr w:type="spellEnd"/>
+      <w:r>
+        <w:rPr>
+          <w:lang w:val="es-ES"/>
+        </w:rPr>
+        <w:t xml:space="preserve"> en su misma red).</w:t>
+      </w:r>
+    </w:p>
+    <w:p>
+      <w:pPr>
+        <w:pStyle w:val="Sinespaciado"/>
+        <w:numPr>
+          <w:ilvl w:val="0"/>
+          <w:numId w:val="9"/>
+        </w:numPr>
+        <w:rPr>
+          <w:lang w:val="es-ES"/>
+        </w:rPr>
+      </w:pPr>
+      <w:r>
+        <w:rPr>
+          <w:b/>
+          <w:bCs/>
+          <w:lang w:val="es-ES"/>
+        </w:rPr>
+        <w:t>Cliente C</w:t>
+      </w:r>
+      <w:r>
+        <w:rPr>
+          <w:lang w:val="es-ES"/>
+        </w:rPr>
+        <w:t xml:space="preserve"> necesita una ruta hacia A1. Su siguiente salto es R22 (la interfaz del </w:t>
+      </w:r>
+      <w:proofErr w:type="spellStart"/>
+      <w:r>
+        <w:rPr>
+          <w:lang w:val="es-ES"/>
+        </w:rPr>
+        <w:t>router</w:t>
+      </w:r>
+      <w:proofErr w:type="spellEnd"/>
+      <w:r>
+        <w:rPr>
+          <w:lang w:val="es-ES"/>
+        </w:rPr>
+        <w:t xml:space="preserve"> en su misma red).</w:t>
+      </w:r>
+    </w:p>
+    <w:p>
+      <w:pPr>
+        <w:pStyle w:val="Sinespaciado"/>
+        <w:numPr>
+          <w:ilvl w:val="0"/>
+          <w:numId w:val="9"/>
+        </w:numPr>
+        <w:rPr>
+          <w:lang w:val="es-ES"/>
+        </w:rPr>
+      </w:pPr>
+      <w:proofErr w:type="spellStart"/>
+      <w:r>
+        <w:rPr>
+          <w:b/>
+          <w:bCs/>
+          <w:lang w:val="es-ES"/>
+        </w:rPr>
+        <w:t>Router</w:t>
+      </w:r>
+      <w:proofErr w:type="spellEnd"/>
+      <w:r>
+        <w:rPr>
+          <w:b/>
+          <w:bCs/>
+          <w:lang w:val="es-ES"/>
+        </w:rPr>
+        <w:t xml:space="preserve"> R1</w:t>
+      </w:r>
+      <w:r>
+        <w:rPr>
+          <w:lang w:val="es-ES"/>
+        </w:rPr>
+        <w:t xml:space="preserve"> necesita saber </w:t>
+      </w:r>
+      <w:r>
+        <w:rPr>
+          <w:lang w:val="es-ES"/>
+        </w:rPr>
+        <w:t>cómo</w:t>
+      </w:r>
+      <w:r>
+        <w:rPr>
+          <w:lang w:val="es-ES"/>
+        </w:rPr>
+        <w:t xml:space="preserve"> llegar a la red 3. Su siguiente salto es R21 (la interfaz de R2 en la red intermedia).</w:t>
+      </w:r>
+    </w:p>
+    <w:p>
+      <w:pPr>
+        <w:pStyle w:val="Sinespaciado"/>
+        <w:numPr>
+          <w:ilvl w:val="0"/>
+          <w:numId w:val="9"/>
+        </w:numPr>
+        <w:rPr>
+          <w:lang w:val="es-ES"/>
+        </w:rPr>
+      </w:pPr>
+      <w:proofErr w:type="spellStart"/>
+      <w:r>
+        <w:rPr>
+          <w:b/>
+          <w:bCs/>
+          <w:lang w:val="es-ES"/>
+        </w:rPr>
+        <w:t>Router</w:t>
+      </w:r>
+      <w:proofErr w:type="spellEnd"/>
+      <w:r>
+        <w:rPr>
+          <w:b/>
+          <w:bCs/>
+          <w:lang w:val="es-ES"/>
+        </w:rPr>
+        <w:t xml:space="preserve"> R2</w:t>
+      </w:r>
+      <w:r>
+        <w:rPr>
+          <w:lang w:val="es-ES"/>
+        </w:rPr>
+        <w:t xml:space="preserve"> necesita saber </w:t>
+      </w:r>
+      <w:r>
+        <w:rPr>
+          <w:lang w:val="es-ES"/>
+        </w:rPr>
+        <w:t>cómo</w:t>
+      </w:r>
+      <w:r>
+        <w:rPr>
+          <w:lang w:val="es-ES"/>
+        </w:rPr>
+        <w:t xml:space="preserve"> llegar a la red 1. Su siguiente salto es R12 (la interfaz de R1 en la red intermedia).</w:t>
+      </w:r>
+    </w:p>
+    <w:p>
+      <w:pPr>
+        <w:pStyle w:val="Sinespaciado"/>
+        <w:ind w:left="720"/>
+        <w:rPr>
+          <w:lang w:val="es-ES"/>
+        </w:rPr>
+      </w:pPr>
+    </w:p>
+    <w:p>
+      <w:pPr>
+        <w:pStyle w:val="Sinespaciado"/>
+        <w:rPr>
+          <w:lang w:val="es-ES"/>
+        </w:rPr>
+      </w:pPr>
+      <w:r>
+        <w:rPr>
+          <w:b/>
+          <w:bCs/>
+          <w:lang w:val="es-ES"/>
+        </w:rPr>
+        <w:t>Concepto clave de este nivel</w:t>
+      </w:r>
+    </w:p>
+    <w:p>
+      <w:pPr>
+        <w:pStyle w:val="Sinespaciado"/>
+        <w:rPr>
+          <w:lang w:val="es-ES"/>
+        </w:rPr>
+      </w:pPr>
+    </w:p>
+    <w:p>
+      <w:pPr>
+        <w:pStyle w:val="Sinespaciado"/>
+        <w:rPr>
+          <w:lang w:val="es-ES"/>
+        </w:rPr>
+      </w:pPr>
+      <w:r>
+        <w:rPr>
+          <w:lang w:val="es-ES"/>
+        </w:rPr>
+        <w:t xml:space="preserve">Cada </w:t>
+      </w:r>
+      <w:proofErr w:type="spellStart"/>
+      <w:r>
+        <w:rPr>
+          <w:lang w:val="es-ES"/>
+        </w:rPr>
+        <w:t>router</w:t>
+      </w:r>
+      <w:proofErr w:type="spellEnd"/>
+      <w:r>
+        <w:rPr>
+          <w:lang w:val="es-ES"/>
+        </w:rPr>
+        <w:t xml:space="preserve"> conecta redes distintas y cada una de sus interfaces pertenece a una red diferente. Nunca pueden solaparse los rangos de </w:t>
+      </w:r>
+      <w:proofErr w:type="spellStart"/>
+      <w:r>
+        <w:rPr>
+          <w:lang w:val="es-ES"/>
+        </w:rPr>
+        <w:t>IPs</w:t>
+      </w:r>
+      <w:proofErr w:type="spellEnd"/>
+      <w:r>
+        <w:rPr>
+          <w:lang w:val="es-ES"/>
+        </w:rPr>
+        <w:t xml:space="preserve"> entre interfaces </w:t>
+      </w:r>
+      <w:proofErr w:type="gramStart"/>
+      <w:r>
+        <w:rPr>
+          <w:lang w:val="es-ES"/>
+        </w:rPr>
+        <w:t>del mismo</w:t>
+      </w:r>
+      <w:proofErr w:type="gramEnd"/>
+      <w:r>
+        <w:rPr>
+          <w:lang w:val="es-ES"/>
+        </w:rPr>
+        <w:t xml:space="preserve"> </w:t>
+      </w:r>
+      <w:proofErr w:type="spellStart"/>
+      <w:r>
+        <w:rPr>
+          <w:lang w:val="es-ES"/>
+        </w:rPr>
+        <w:t>router</w:t>
+      </w:r>
+      <w:proofErr w:type="spellEnd"/>
+      <w:r>
+        <w:rPr>
+          <w:lang w:val="es-ES"/>
+        </w:rPr>
+        <w:t xml:space="preserve">, de lo contrario el </w:t>
+      </w:r>
+      <w:proofErr w:type="spellStart"/>
+      <w:r>
+        <w:rPr>
+          <w:lang w:val="es-ES"/>
+        </w:rPr>
+        <w:t>router</w:t>
+      </w:r>
+      <w:proofErr w:type="spellEnd"/>
+      <w:r>
+        <w:rPr>
+          <w:lang w:val="es-ES"/>
+        </w:rPr>
+        <w:t xml:space="preserve"> no puede enrutar correctamente.</w:t>
+      </w:r>
+    </w:p>
+    <w:p>
+      <w:pPr>
+        <w:pStyle w:val="Sinespaciado"/>
+        <w:rPr>
+          <w:lang w:val="es-ES"/>
+        </w:rPr>
+      </w:pPr>
+    </w:p>
+    <w:p>
+      <w:pPr>
+        <w:pStyle w:val="Sinespaciado"/>
+        <w:jc w:val="center"/>
+        <w:rPr>
+          <w:lang w:val="es-ES"/>
+        </w:rPr>
+      </w:pPr>
+      <w:r>
+        <w:rPr>
+          <w:noProof/>
+        </w:rPr>
+        <w:drawing>
+          <wp:inline distT="0" distB="0" distL="0" distR="0" wp14:anchorId="6A7DB99D" wp14:editId="4EC030D2">
+            <wp:extent cx="5594321" cy="3804138"/>
+            <wp:effectExtent l="0" t="0" r="6985" b="6350"/>
+            <wp:docPr id="806404686" name="Imagen 1" descr="Direcciones IP y Máscara de Red"/>
+            <wp:cNvGraphicFramePr>
+              <a:graphicFrameLocks xmlns:a="http://schemas.openxmlformats.org/drawingml/2006/main" noChangeAspect="1"/>
+            </wp:cNvGraphicFramePr>
+            <a:graphic xmlns:a="http://schemas.openxmlformats.org/drawingml/2006/main">
+              <a:graphicData uri="http://schemas.openxmlformats.org/drawingml/2006/picture">
+                <pic:pic xmlns:pic="http://schemas.openxmlformats.org/drawingml/2006/picture">
+                  <pic:nvPicPr>
+                    <pic:cNvPr id="0" name="Picture 1" descr="Direcciones IP y Máscara de Red"/>
+                    <pic:cNvPicPr>
+                      <a:picLocks noChangeAspect="1" noChangeArrowheads="1"/>
+                    </pic:cNvPicPr>
+                  </pic:nvPicPr>
+                  <pic:blipFill>
+                    <a:blip r:embed="rId8">
+                      <a:extLst>
+                        <a:ext uri="{28A0092B-C50C-407E-A947-70E740481C1C}">
+                          <a14:useLocalDpi xmlns:a14="http://schemas.microsoft.com/office/drawing/2010/main" val="0"/>
+                        </a:ext>
+                      </a:extLst>
+                    </a:blip>
+                    <a:srcRect/>
+                    <a:stretch>
+                      <a:fillRect/>
+                    </a:stretch>
+                  </pic:blipFill>
+                  <pic:spPr bwMode="auto">
+                    <a:xfrm>
+                      <a:off x="0" y="0"/>
+                      <a:ext cx="5600689" cy="3808469"/>
+                    </a:xfrm>
+                    <a:prstGeom prst="rect">
+                      <a:avLst/>
+                    </a:prstGeom>
+                    <a:noFill/>
+                    <a:ln>
+                      <a:noFill/>
+                    </a:ln>
+                  </pic:spPr>
+                </pic:pic>
+              </a:graphicData>
+            </a:graphic>
+          </wp:inline>
+        </w:drawing>
       </w:r>
     </w:p>
     <w:p>
@@ -11673,6 +13855,602 @@
     </w:lvl>
   </w:abstractNum>
   <w:abstractNum w:abstractNumId="2" w15:restartNumberingAfterBreak="0">
+    <w:nsid w:val="1E5B316F"/>
+    <w:multiLevelType w:val="multilevel"/>
+    <w:tmpl w:val="640A2CF6"/>
+    <w:lvl w:ilvl="0">
+      <w:start w:val="1"/>
+      <w:numFmt w:val="bullet"/>
+      <w:lvlText w:val=""/>
+      <w:lvlJc w:val="left"/>
+      <w:pPr>
+        <w:tabs>
+          <w:tab w:val="num" w:pos="720"/>
+        </w:tabs>
+        <w:ind w:left="720" w:hanging="360"/>
+      </w:pPr>
+      <w:rPr>
+        <w:rFonts w:ascii="Symbol" w:hAnsi="Symbol" w:hint="default"/>
+        <w:sz w:val="20"/>
+      </w:rPr>
+    </w:lvl>
+    <w:lvl w:ilvl="1" w:tentative="1">
+      <w:start w:val="1"/>
+      <w:numFmt w:val="bullet"/>
+      <w:lvlText w:val="o"/>
+      <w:lvlJc w:val="left"/>
+      <w:pPr>
+        <w:tabs>
+          <w:tab w:val="num" w:pos="1440"/>
+        </w:tabs>
+        <w:ind w:left="1440" w:hanging="360"/>
+      </w:pPr>
+      <w:rPr>
+        <w:rFonts w:ascii="Courier New" w:hAnsi="Courier New" w:hint="default"/>
+        <w:sz w:val="20"/>
+      </w:rPr>
+    </w:lvl>
+    <w:lvl w:ilvl="2" w:tentative="1">
+      <w:start w:val="1"/>
+      <w:numFmt w:val="bullet"/>
+      <w:lvlText w:val=""/>
+      <w:lvlJc w:val="left"/>
+      <w:pPr>
+        <w:tabs>
+          <w:tab w:val="num" w:pos="2160"/>
+        </w:tabs>
+        <w:ind w:left="2160" w:hanging="360"/>
+      </w:pPr>
+      <w:rPr>
+        <w:rFonts w:ascii="Wingdings" w:hAnsi="Wingdings" w:hint="default"/>
+        <w:sz w:val="20"/>
+      </w:rPr>
+    </w:lvl>
+    <w:lvl w:ilvl="3" w:tentative="1">
+      <w:start w:val="1"/>
+      <w:numFmt w:val="bullet"/>
+      <w:lvlText w:val=""/>
+      <w:lvlJc w:val="left"/>
+      <w:pPr>
+        <w:tabs>
+          <w:tab w:val="num" w:pos="2880"/>
+        </w:tabs>
+        <w:ind w:left="2880" w:hanging="360"/>
+      </w:pPr>
+      <w:rPr>
+        <w:rFonts w:ascii="Wingdings" w:hAnsi="Wingdings" w:hint="default"/>
+        <w:sz w:val="20"/>
+      </w:rPr>
+    </w:lvl>
+    <w:lvl w:ilvl="4" w:tentative="1">
+      <w:start w:val="1"/>
+      <w:numFmt w:val="bullet"/>
+      <w:lvlText w:val=""/>
+      <w:lvlJc w:val="left"/>
+      <w:pPr>
+        <w:tabs>
+          <w:tab w:val="num" w:pos="3600"/>
+        </w:tabs>
+        <w:ind w:left="3600" w:hanging="360"/>
+      </w:pPr>
+      <w:rPr>
+        <w:rFonts w:ascii="Wingdings" w:hAnsi="Wingdings" w:hint="default"/>
+        <w:sz w:val="20"/>
+      </w:rPr>
+    </w:lvl>
+    <w:lvl w:ilvl="5" w:tentative="1">
+      <w:start w:val="1"/>
+      <w:numFmt w:val="bullet"/>
+      <w:lvlText w:val=""/>
+      <w:lvlJc w:val="left"/>
+      <w:pPr>
+        <w:tabs>
+          <w:tab w:val="num" w:pos="4320"/>
+        </w:tabs>
+        <w:ind w:left="4320" w:hanging="360"/>
+      </w:pPr>
+      <w:rPr>
+        <w:rFonts w:ascii="Wingdings" w:hAnsi="Wingdings" w:hint="default"/>
+        <w:sz w:val="20"/>
+      </w:rPr>
+    </w:lvl>
+    <w:lvl w:ilvl="6" w:tentative="1">
+      <w:start w:val="1"/>
+      <w:numFmt w:val="bullet"/>
+      <w:lvlText w:val=""/>
+      <w:lvlJc w:val="left"/>
+      <w:pPr>
+        <w:tabs>
+          <w:tab w:val="num" w:pos="5040"/>
+        </w:tabs>
+        <w:ind w:left="5040" w:hanging="360"/>
+      </w:pPr>
+      <w:rPr>
+        <w:rFonts w:ascii="Wingdings" w:hAnsi="Wingdings" w:hint="default"/>
+        <w:sz w:val="20"/>
+      </w:rPr>
+    </w:lvl>
+    <w:lvl w:ilvl="7" w:tentative="1">
+      <w:start w:val="1"/>
+      <w:numFmt w:val="bullet"/>
+      <w:lvlText w:val=""/>
+      <w:lvlJc w:val="left"/>
+      <w:pPr>
+        <w:tabs>
+          <w:tab w:val="num" w:pos="5760"/>
+        </w:tabs>
+        <w:ind w:left="5760" w:hanging="360"/>
+      </w:pPr>
+      <w:rPr>
+        <w:rFonts w:ascii="Wingdings" w:hAnsi="Wingdings" w:hint="default"/>
+        <w:sz w:val="20"/>
+      </w:rPr>
+    </w:lvl>
+    <w:lvl w:ilvl="8" w:tentative="1">
+      <w:start w:val="1"/>
+      <w:numFmt w:val="bullet"/>
+      <w:lvlText w:val=""/>
+      <w:lvlJc w:val="left"/>
+      <w:pPr>
+        <w:tabs>
+          <w:tab w:val="num" w:pos="6480"/>
+        </w:tabs>
+        <w:ind w:left="6480" w:hanging="360"/>
+      </w:pPr>
+      <w:rPr>
+        <w:rFonts w:ascii="Wingdings" w:hAnsi="Wingdings" w:hint="default"/>
+        <w:sz w:val="20"/>
+      </w:rPr>
+    </w:lvl>
+  </w:abstractNum>
+  <w:abstractNum w:abstractNumId="3" w15:restartNumberingAfterBreak="0">
+    <w:nsid w:val="202C61BF"/>
+    <w:multiLevelType w:val="multilevel"/>
+    <w:tmpl w:val="6B807A24"/>
+    <w:lvl w:ilvl="0">
+      <w:start w:val="1"/>
+      <w:numFmt w:val="bullet"/>
+      <w:lvlText w:val=""/>
+      <w:lvlJc w:val="left"/>
+      <w:pPr>
+        <w:tabs>
+          <w:tab w:val="num" w:pos="720"/>
+        </w:tabs>
+        <w:ind w:left="720" w:hanging="360"/>
+      </w:pPr>
+      <w:rPr>
+        <w:rFonts w:ascii="Symbol" w:hAnsi="Symbol" w:hint="default"/>
+        <w:sz w:val="20"/>
+      </w:rPr>
+    </w:lvl>
+    <w:lvl w:ilvl="1" w:tentative="1">
+      <w:start w:val="1"/>
+      <w:numFmt w:val="bullet"/>
+      <w:lvlText w:val="o"/>
+      <w:lvlJc w:val="left"/>
+      <w:pPr>
+        <w:tabs>
+          <w:tab w:val="num" w:pos="1440"/>
+        </w:tabs>
+        <w:ind w:left="1440" w:hanging="360"/>
+      </w:pPr>
+      <w:rPr>
+        <w:rFonts w:ascii="Courier New" w:hAnsi="Courier New" w:hint="default"/>
+        <w:sz w:val="20"/>
+      </w:rPr>
+    </w:lvl>
+    <w:lvl w:ilvl="2" w:tentative="1">
+      <w:start w:val="1"/>
+      <w:numFmt w:val="bullet"/>
+      <w:lvlText w:val=""/>
+      <w:lvlJc w:val="left"/>
+      <w:pPr>
+        <w:tabs>
+          <w:tab w:val="num" w:pos="2160"/>
+        </w:tabs>
+        <w:ind w:left="2160" w:hanging="360"/>
+      </w:pPr>
+      <w:rPr>
+        <w:rFonts w:ascii="Wingdings" w:hAnsi="Wingdings" w:hint="default"/>
+        <w:sz w:val="20"/>
+      </w:rPr>
+    </w:lvl>
+    <w:lvl w:ilvl="3" w:tentative="1">
+      <w:start w:val="1"/>
+      <w:numFmt w:val="bullet"/>
+      <w:lvlText w:val=""/>
+      <w:lvlJc w:val="left"/>
+      <w:pPr>
+        <w:tabs>
+          <w:tab w:val="num" w:pos="2880"/>
+        </w:tabs>
+        <w:ind w:left="2880" w:hanging="360"/>
+      </w:pPr>
+      <w:rPr>
+        <w:rFonts w:ascii="Wingdings" w:hAnsi="Wingdings" w:hint="default"/>
+        <w:sz w:val="20"/>
+      </w:rPr>
+    </w:lvl>
+    <w:lvl w:ilvl="4" w:tentative="1">
+      <w:start w:val="1"/>
+      <w:numFmt w:val="bullet"/>
+      <w:lvlText w:val=""/>
+      <w:lvlJc w:val="left"/>
+      <w:pPr>
+        <w:tabs>
+          <w:tab w:val="num" w:pos="3600"/>
+        </w:tabs>
+        <w:ind w:left="3600" w:hanging="360"/>
+      </w:pPr>
+      <w:rPr>
+        <w:rFonts w:ascii="Wingdings" w:hAnsi="Wingdings" w:hint="default"/>
+        <w:sz w:val="20"/>
+      </w:rPr>
+    </w:lvl>
+    <w:lvl w:ilvl="5" w:tentative="1">
+      <w:start w:val="1"/>
+      <w:numFmt w:val="bullet"/>
+      <w:lvlText w:val=""/>
+      <w:lvlJc w:val="left"/>
+      <w:pPr>
+        <w:tabs>
+          <w:tab w:val="num" w:pos="4320"/>
+        </w:tabs>
+        <w:ind w:left="4320" w:hanging="360"/>
+      </w:pPr>
+      <w:rPr>
+        <w:rFonts w:ascii="Wingdings" w:hAnsi="Wingdings" w:hint="default"/>
+        <w:sz w:val="20"/>
+      </w:rPr>
+    </w:lvl>
+    <w:lvl w:ilvl="6" w:tentative="1">
+      <w:start w:val="1"/>
+      <w:numFmt w:val="bullet"/>
+      <w:lvlText w:val=""/>
+      <w:lvlJc w:val="left"/>
+      <w:pPr>
+        <w:tabs>
+          <w:tab w:val="num" w:pos="5040"/>
+        </w:tabs>
+        <w:ind w:left="5040" w:hanging="360"/>
+      </w:pPr>
+      <w:rPr>
+        <w:rFonts w:ascii="Wingdings" w:hAnsi="Wingdings" w:hint="default"/>
+        <w:sz w:val="20"/>
+      </w:rPr>
+    </w:lvl>
+    <w:lvl w:ilvl="7" w:tentative="1">
+      <w:start w:val="1"/>
+      <w:numFmt w:val="bullet"/>
+      <w:lvlText w:val=""/>
+      <w:lvlJc w:val="left"/>
+      <w:pPr>
+        <w:tabs>
+          <w:tab w:val="num" w:pos="5760"/>
+        </w:tabs>
+        <w:ind w:left="5760" w:hanging="360"/>
+      </w:pPr>
+      <w:rPr>
+        <w:rFonts w:ascii="Wingdings" w:hAnsi="Wingdings" w:hint="default"/>
+        <w:sz w:val="20"/>
+      </w:rPr>
+    </w:lvl>
+    <w:lvl w:ilvl="8" w:tentative="1">
+      <w:start w:val="1"/>
+      <w:numFmt w:val="bullet"/>
+      <w:lvlText w:val=""/>
+      <w:lvlJc w:val="left"/>
+      <w:pPr>
+        <w:tabs>
+          <w:tab w:val="num" w:pos="6480"/>
+        </w:tabs>
+        <w:ind w:left="6480" w:hanging="360"/>
+      </w:pPr>
+      <w:rPr>
+        <w:rFonts w:ascii="Wingdings" w:hAnsi="Wingdings" w:hint="default"/>
+        <w:sz w:val="20"/>
+      </w:rPr>
+    </w:lvl>
+  </w:abstractNum>
+  <w:abstractNum w:abstractNumId="4" w15:restartNumberingAfterBreak="0">
+    <w:nsid w:val="296D026B"/>
+    <w:multiLevelType w:val="multilevel"/>
+    <w:tmpl w:val="FC3E6EF4"/>
+    <w:lvl w:ilvl="0">
+      <w:start w:val="1"/>
+      <w:numFmt w:val="bullet"/>
+      <w:lvlText w:val=""/>
+      <w:lvlJc w:val="left"/>
+      <w:pPr>
+        <w:tabs>
+          <w:tab w:val="num" w:pos="720"/>
+        </w:tabs>
+        <w:ind w:left="720" w:hanging="360"/>
+      </w:pPr>
+      <w:rPr>
+        <w:rFonts w:ascii="Symbol" w:hAnsi="Symbol" w:hint="default"/>
+        <w:sz w:val="20"/>
+      </w:rPr>
+    </w:lvl>
+    <w:lvl w:ilvl="1" w:tentative="1">
+      <w:start w:val="1"/>
+      <w:numFmt w:val="bullet"/>
+      <w:lvlText w:val="o"/>
+      <w:lvlJc w:val="left"/>
+      <w:pPr>
+        <w:tabs>
+          <w:tab w:val="num" w:pos="1440"/>
+        </w:tabs>
+        <w:ind w:left="1440" w:hanging="360"/>
+      </w:pPr>
+      <w:rPr>
+        <w:rFonts w:ascii="Courier New" w:hAnsi="Courier New" w:hint="default"/>
+        <w:sz w:val="20"/>
+      </w:rPr>
+    </w:lvl>
+    <w:lvl w:ilvl="2" w:tentative="1">
+      <w:start w:val="1"/>
+      <w:numFmt w:val="bullet"/>
+      <w:lvlText w:val=""/>
+      <w:lvlJc w:val="left"/>
+      <w:pPr>
+        <w:tabs>
+          <w:tab w:val="num" w:pos="2160"/>
+        </w:tabs>
+        <w:ind w:left="2160" w:hanging="360"/>
+      </w:pPr>
+      <w:rPr>
+        <w:rFonts w:ascii="Wingdings" w:hAnsi="Wingdings" w:hint="default"/>
+        <w:sz w:val="20"/>
+      </w:rPr>
+    </w:lvl>
+    <w:lvl w:ilvl="3" w:tentative="1">
+      <w:start w:val="1"/>
+      <w:numFmt w:val="bullet"/>
+      <w:lvlText w:val=""/>
+      <w:lvlJc w:val="left"/>
+      <w:pPr>
+        <w:tabs>
+          <w:tab w:val="num" w:pos="2880"/>
+        </w:tabs>
+        <w:ind w:left="2880" w:hanging="360"/>
+      </w:pPr>
+      <w:rPr>
+        <w:rFonts w:ascii="Wingdings" w:hAnsi="Wingdings" w:hint="default"/>
+        <w:sz w:val="20"/>
+      </w:rPr>
+    </w:lvl>
+    <w:lvl w:ilvl="4" w:tentative="1">
+      <w:start w:val="1"/>
+      <w:numFmt w:val="bullet"/>
+      <w:lvlText w:val=""/>
+      <w:lvlJc w:val="left"/>
+      <w:pPr>
+        <w:tabs>
+          <w:tab w:val="num" w:pos="3600"/>
+        </w:tabs>
+        <w:ind w:left="3600" w:hanging="360"/>
+      </w:pPr>
+      <w:rPr>
+        <w:rFonts w:ascii="Wingdings" w:hAnsi="Wingdings" w:hint="default"/>
+        <w:sz w:val="20"/>
+      </w:rPr>
+    </w:lvl>
+    <w:lvl w:ilvl="5" w:tentative="1">
+      <w:start w:val="1"/>
+      <w:numFmt w:val="bullet"/>
+      <w:lvlText w:val=""/>
+      <w:lvlJc w:val="left"/>
+      <w:pPr>
+        <w:tabs>
+          <w:tab w:val="num" w:pos="4320"/>
+        </w:tabs>
+        <w:ind w:left="4320" w:hanging="360"/>
+      </w:pPr>
+      <w:rPr>
+        <w:rFonts w:ascii="Wingdings" w:hAnsi="Wingdings" w:hint="default"/>
+        <w:sz w:val="20"/>
+      </w:rPr>
+    </w:lvl>
+    <w:lvl w:ilvl="6" w:tentative="1">
+      <w:start w:val="1"/>
+      <w:numFmt w:val="bullet"/>
+      <w:lvlText w:val=""/>
+      <w:lvlJc w:val="left"/>
+      <w:pPr>
+        <w:tabs>
+          <w:tab w:val="num" w:pos="5040"/>
+        </w:tabs>
+        <w:ind w:left="5040" w:hanging="360"/>
+      </w:pPr>
+      <w:rPr>
+        <w:rFonts w:ascii="Wingdings" w:hAnsi="Wingdings" w:hint="default"/>
+        <w:sz w:val="20"/>
+      </w:rPr>
+    </w:lvl>
+    <w:lvl w:ilvl="7" w:tentative="1">
+      <w:start w:val="1"/>
+      <w:numFmt w:val="bullet"/>
+      <w:lvlText w:val=""/>
+      <w:lvlJc w:val="left"/>
+      <w:pPr>
+        <w:tabs>
+          <w:tab w:val="num" w:pos="5760"/>
+        </w:tabs>
+        <w:ind w:left="5760" w:hanging="360"/>
+      </w:pPr>
+      <w:rPr>
+        <w:rFonts w:ascii="Wingdings" w:hAnsi="Wingdings" w:hint="default"/>
+        <w:sz w:val="20"/>
+      </w:rPr>
+    </w:lvl>
+    <w:lvl w:ilvl="8" w:tentative="1">
+      <w:start w:val="1"/>
+      <w:numFmt w:val="bullet"/>
+      <w:lvlText w:val=""/>
+      <w:lvlJc w:val="left"/>
+      <w:pPr>
+        <w:tabs>
+          <w:tab w:val="num" w:pos="6480"/>
+        </w:tabs>
+        <w:ind w:left="6480" w:hanging="360"/>
+      </w:pPr>
+      <w:rPr>
+        <w:rFonts w:ascii="Wingdings" w:hAnsi="Wingdings" w:hint="default"/>
+        <w:sz w:val="20"/>
+      </w:rPr>
+    </w:lvl>
+  </w:abstractNum>
+  <w:abstractNum w:abstractNumId="5" w15:restartNumberingAfterBreak="0">
+    <w:nsid w:val="2E331EC4"/>
+    <w:multiLevelType w:val="multilevel"/>
+    <w:tmpl w:val="03D8CE5A"/>
+    <w:lvl w:ilvl="0">
+      <w:start w:val="1"/>
+      <w:numFmt w:val="bullet"/>
+      <w:lvlText w:val=""/>
+      <w:lvlJc w:val="left"/>
+      <w:pPr>
+        <w:tabs>
+          <w:tab w:val="num" w:pos="720"/>
+        </w:tabs>
+        <w:ind w:left="720" w:hanging="360"/>
+      </w:pPr>
+      <w:rPr>
+        <w:rFonts w:ascii="Symbol" w:hAnsi="Symbol" w:hint="default"/>
+        <w:sz w:val="20"/>
+      </w:rPr>
+    </w:lvl>
+    <w:lvl w:ilvl="1" w:tentative="1">
+      <w:start w:val="1"/>
+      <w:numFmt w:val="bullet"/>
+      <w:lvlText w:val="o"/>
+      <w:lvlJc w:val="left"/>
+      <w:pPr>
+        <w:tabs>
+          <w:tab w:val="num" w:pos="1440"/>
+        </w:tabs>
+        <w:ind w:left="1440" w:hanging="360"/>
+      </w:pPr>
+      <w:rPr>
+        <w:rFonts w:ascii="Courier New" w:hAnsi="Courier New" w:hint="default"/>
+        <w:sz w:val="20"/>
+      </w:rPr>
+    </w:lvl>
+    <w:lvl w:ilvl="2" w:tentative="1">
+      <w:start w:val="1"/>
+      <w:numFmt w:val="bullet"/>
+      <w:lvlText w:val=""/>
+      <w:lvlJc w:val="left"/>
+      <w:pPr>
+        <w:tabs>
+          <w:tab w:val="num" w:pos="2160"/>
+        </w:tabs>
+        <w:ind w:left="2160" w:hanging="360"/>
+      </w:pPr>
+      <w:rPr>
+        <w:rFonts w:ascii="Wingdings" w:hAnsi="Wingdings" w:hint="default"/>
+        <w:sz w:val="20"/>
+      </w:rPr>
+    </w:lvl>
+    <w:lvl w:ilvl="3" w:tentative="1">
+      <w:start w:val="1"/>
+      <w:numFmt w:val="bullet"/>
+      <w:lvlText w:val=""/>
+      <w:lvlJc w:val="left"/>
+      <w:pPr>
+        <w:tabs>
+          <w:tab w:val="num" w:pos="2880"/>
+        </w:tabs>
+        <w:ind w:left="2880" w:hanging="360"/>
+      </w:pPr>
+      <w:rPr>
+        <w:rFonts w:ascii="Wingdings" w:hAnsi="Wingdings" w:hint="default"/>
+        <w:sz w:val="20"/>
+      </w:rPr>
+    </w:lvl>
+    <w:lvl w:ilvl="4" w:tentative="1">
+      <w:start w:val="1"/>
+      <w:numFmt w:val="bullet"/>
+      <w:lvlText w:val=""/>
+      <w:lvlJc w:val="left"/>
+      <w:pPr>
+        <w:tabs>
+          <w:tab w:val="num" w:pos="3600"/>
+        </w:tabs>
+        <w:ind w:left="3600" w:hanging="360"/>
+      </w:pPr>
+      <w:rPr>
+        <w:rFonts w:ascii="Wingdings" w:hAnsi="Wingdings" w:hint="default"/>
+        <w:sz w:val="20"/>
+      </w:rPr>
+    </w:lvl>
+    <w:lvl w:ilvl="5" w:tentative="1">
+      <w:start w:val="1"/>
+      <w:numFmt w:val="bullet"/>
+      <w:lvlText w:val=""/>
+      <w:lvlJc w:val="left"/>
+      <w:pPr>
+        <w:tabs>
+          <w:tab w:val="num" w:pos="4320"/>
+        </w:tabs>
+        <w:ind w:left="4320" w:hanging="360"/>
+      </w:pPr>
+      <w:rPr>
+        <w:rFonts w:ascii="Wingdings" w:hAnsi="Wingdings" w:hint="default"/>
+        <w:sz w:val="20"/>
+      </w:rPr>
+    </w:lvl>
+    <w:lvl w:ilvl="6" w:tentative="1">
+      <w:start w:val="1"/>
+      <w:numFmt w:val="bullet"/>
+      <w:lvlText w:val=""/>
+      <w:lvlJc w:val="left"/>
+      <w:pPr>
+        <w:tabs>
+          <w:tab w:val="num" w:pos="5040"/>
+        </w:tabs>
+        <w:ind w:left="5040" w:hanging="360"/>
+      </w:pPr>
+      <w:rPr>
+        <w:rFonts w:ascii="Wingdings" w:hAnsi="Wingdings" w:hint="default"/>
+        <w:sz w:val="20"/>
+      </w:rPr>
+    </w:lvl>
+    <w:lvl w:ilvl="7" w:tentative="1">
+      <w:start w:val="1"/>
+      <w:numFmt w:val="bullet"/>
+      <w:lvlText w:val=""/>
+      <w:lvlJc w:val="left"/>
+      <w:pPr>
+        <w:tabs>
+          <w:tab w:val="num" w:pos="5760"/>
+        </w:tabs>
+        <w:ind w:left="5760" w:hanging="360"/>
+      </w:pPr>
+      <w:rPr>
+        <w:rFonts w:ascii="Wingdings" w:hAnsi="Wingdings" w:hint="default"/>
+        <w:sz w:val="20"/>
+      </w:rPr>
+    </w:lvl>
+    <w:lvl w:ilvl="8" w:tentative="1">
+      <w:start w:val="1"/>
+      <w:numFmt w:val="bullet"/>
+      <w:lvlText w:val=""/>
+      <w:lvlJc w:val="left"/>
+      <w:pPr>
+        <w:tabs>
+          <w:tab w:val="num" w:pos="6480"/>
+        </w:tabs>
+        <w:ind w:left="6480" w:hanging="360"/>
+      </w:pPr>
+      <w:rPr>
+        <w:rFonts w:ascii="Wingdings" w:hAnsi="Wingdings" w:hint="default"/>
+        <w:sz w:val="20"/>
+      </w:rPr>
+    </w:lvl>
+  </w:abstractNum>
+  <w:abstractNum w:abstractNumId="6" w15:restartNumberingAfterBreak="0">
     <w:nsid w:val="38391C89"/>
     <w:multiLevelType w:val="hybridMultilevel"/>
     <w:tmpl w:val="CA9A0ABC"/>
@@ -11758,7 +14536,7 @@
       </w:pPr>
     </w:lvl>
   </w:abstractNum>
-  <w:abstractNum w:abstractNumId="3" w15:restartNumberingAfterBreak="0">
+  <w:abstractNum w:abstractNumId="7" w15:restartNumberingAfterBreak="0">
     <w:nsid w:val="5E0C2B87"/>
     <w:multiLevelType w:val="hybridMultilevel"/>
     <w:tmpl w:val="084CB28C"/>
@@ -11812,8 +14590,157 @@
       <w:lvlJc w:val="left"/>
     </w:lvl>
   </w:abstractNum>
+  <w:abstractNum w:abstractNumId="8" w15:restartNumberingAfterBreak="0">
+    <w:nsid w:val="75F80C72"/>
+    <w:multiLevelType w:val="multilevel"/>
+    <w:tmpl w:val="5B228E40"/>
+    <w:lvl w:ilvl="0">
+      <w:start w:val="1"/>
+      <w:numFmt w:val="bullet"/>
+      <w:lvlText w:val=""/>
+      <w:lvlJc w:val="left"/>
+      <w:pPr>
+        <w:tabs>
+          <w:tab w:val="num" w:pos="720"/>
+        </w:tabs>
+        <w:ind w:left="720" w:hanging="360"/>
+      </w:pPr>
+      <w:rPr>
+        <w:rFonts w:ascii="Symbol" w:hAnsi="Symbol" w:hint="default"/>
+        <w:sz w:val="20"/>
+      </w:rPr>
+    </w:lvl>
+    <w:lvl w:ilvl="1">
+      <w:start w:val="1"/>
+      <w:numFmt w:val="bullet"/>
+      <w:lvlText w:val="o"/>
+      <w:lvlJc w:val="left"/>
+      <w:pPr>
+        <w:tabs>
+          <w:tab w:val="num" w:pos="1440"/>
+        </w:tabs>
+        <w:ind w:left="1440" w:hanging="360"/>
+      </w:pPr>
+      <w:rPr>
+        <w:rFonts w:ascii="Courier New" w:hAnsi="Courier New" w:hint="default"/>
+        <w:sz w:val="20"/>
+      </w:rPr>
+    </w:lvl>
+    <w:lvl w:ilvl="2" w:tentative="1">
+      <w:start w:val="1"/>
+      <w:numFmt w:val="bullet"/>
+      <w:lvlText w:val=""/>
+      <w:lvlJc w:val="left"/>
+      <w:pPr>
+        <w:tabs>
+          <w:tab w:val="num" w:pos="2160"/>
+        </w:tabs>
+        <w:ind w:left="2160" w:hanging="360"/>
+      </w:pPr>
+      <w:rPr>
+        <w:rFonts w:ascii="Wingdings" w:hAnsi="Wingdings" w:hint="default"/>
+        <w:sz w:val="20"/>
+      </w:rPr>
+    </w:lvl>
+    <w:lvl w:ilvl="3" w:tentative="1">
+      <w:start w:val="1"/>
+      <w:numFmt w:val="bullet"/>
+      <w:lvlText w:val=""/>
+      <w:lvlJc w:val="left"/>
+      <w:pPr>
+        <w:tabs>
+          <w:tab w:val="num" w:pos="2880"/>
+        </w:tabs>
+        <w:ind w:left="2880" w:hanging="360"/>
+      </w:pPr>
+      <w:rPr>
+        <w:rFonts w:ascii="Wingdings" w:hAnsi="Wingdings" w:hint="default"/>
+        <w:sz w:val="20"/>
+      </w:rPr>
+    </w:lvl>
+    <w:lvl w:ilvl="4" w:tentative="1">
+      <w:start w:val="1"/>
+      <w:numFmt w:val="bullet"/>
+      <w:lvlText w:val=""/>
+      <w:lvlJc w:val="left"/>
+      <w:pPr>
+        <w:tabs>
+          <w:tab w:val="num" w:pos="3600"/>
+        </w:tabs>
+        <w:ind w:left="3600" w:hanging="360"/>
+      </w:pPr>
+      <w:rPr>
+        <w:rFonts w:ascii="Wingdings" w:hAnsi="Wingdings" w:hint="default"/>
+        <w:sz w:val="20"/>
+      </w:rPr>
+    </w:lvl>
+    <w:lvl w:ilvl="5" w:tentative="1">
+      <w:start w:val="1"/>
+      <w:numFmt w:val="bullet"/>
+      <w:lvlText w:val=""/>
+      <w:lvlJc w:val="left"/>
+      <w:pPr>
+        <w:tabs>
+          <w:tab w:val="num" w:pos="4320"/>
+        </w:tabs>
+        <w:ind w:left="4320" w:hanging="360"/>
+      </w:pPr>
+      <w:rPr>
+        <w:rFonts w:ascii="Wingdings" w:hAnsi="Wingdings" w:hint="default"/>
+        <w:sz w:val="20"/>
+      </w:rPr>
+    </w:lvl>
+    <w:lvl w:ilvl="6" w:tentative="1">
+      <w:start w:val="1"/>
+      <w:numFmt w:val="bullet"/>
+      <w:lvlText w:val=""/>
+      <w:lvlJc w:val="left"/>
+      <w:pPr>
+        <w:tabs>
+          <w:tab w:val="num" w:pos="5040"/>
+        </w:tabs>
+        <w:ind w:left="5040" w:hanging="360"/>
+      </w:pPr>
+      <w:rPr>
+        <w:rFonts w:ascii="Wingdings" w:hAnsi="Wingdings" w:hint="default"/>
+        <w:sz w:val="20"/>
+      </w:rPr>
+    </w:lvl>
+    <w:lvl w:ilvl="7" w:tentative="1">
+      <w:start w:val="1"/>
+      <w:numFmt w:val="bullet"/>
+      <w:lvlText w:val=""/>
+      <w:lvlJc w:val="left"/>
+      <w:pPr>
+        <w:tabs>
+          <w:tab w:val="num" w:pos="5760"/>
+        </w:tabs>
+        <w:ind w:left="5760" w:hanging="360"/>
+      </w:pPr>
+      <w:rPr>
+        <w:rFonts w:ascii="Wingdings" w:hAnsi="Wingdings" w:hint="default"/>
+        <w:sz w:val="20"/>
+      </w:rPr>
+    </w:lvl>
+    <w:lvl w:ilvl="8" w:tentative="1">
+      <w:start w:val="1"/>
+      <w:numFmt w:val="bullet"/>
+      <w:lvlText w:val=""/>
+      <w:lvlJc w:val="left"/>
+      <w:pPr>
+        <w:tabs>
+          <w:tab w:val="num" w:pos="6480"/>
+        </w:tabs>
+        <w:ind w:left="6480" w:hanging="360"/>
+      </w:pPr>
+      <w:rPr>
+        <w:rFonts w:ascii="Wingdings" w:hAnsi="Wingdings" w:hint="default"/>
+        <w:sz w:val="20"/>
+      </w:rPr>
+    </w:lvl>
+  </w:abstractNum>
   <w:num w:numId="1" w16cid:durableId="989477644">
-    <w:abstractNumId w:val="3"/>
+    <w:abstractNumId w:val="7"/>
     <w:lvlOverride w:ilvl="0">
       <w:startOverride w:val="1"/>
     </w:lvlOverride>
@@ -11822,10 +14749,25 @@
     <w:abstractNumId w:val="0"/>
   </w:num>
   <w:num w:numId="3" w16cid:durableId="1726179849">
-    <w:abstractNumId w:val="2"/>
+    <w:abstractNumId w:val="6"/>
   </w:num>
   <w:num w:numId="4" w16cid:durableId="775948513">
     <w:abstractNumId w:val="1"/>
+  </w:num>
+  <w:num w:numId="5" w16cid:durableId="442962598">
+    <w:abstractNumId w:val="3"/>
+  </w:num>
+  <w:num w:numId="6" w16cid:durableId="2017415170">
+    <w:abstractNumId w:val="5"/>
+  </w:num>
+  <w:num w:numId="7" w16cid:durableId="335034274">
+    <w:abstractNumId w:val="2"/>
+  </w:num>
+  <w:num w:numId="8" w16cid:durableId="1593276888">
+    <w:abstractNumId w:val="8"/>
+  </w:num>
+  <w:num w:numId="9" w16cid:durableId="334498094">
+    <w:abstractNumId w:val="4"/>
   </w:num>
 </w:numbering>
 </file>
@@ -12438,7 +15380,6 @@
   <w:style w:type="character" w:default="1" w:styleId="Fuentedeprrafopredeter">
     <w:name w:val="Default Paragraph Font"/>
     <w:uiPriority w:val="1"/>
-    <w:semiHidden/>
     <w:unhideWhenUsed/>
   </w:style>
   <w:style w:type="table" w:default="1" w:styleId="Tablanormal">

</xml_diff>